<commit_message>
Update: Correcciones en Plan de Trabajo, redacción de Tesis.
</commit_message>
<xml_diff>
--- a/docs/Tesis - Villagra Turco, Ezequiel.docx
+++ b/docs/Tesis - Villagra Turco, Ezequiel.docx
@@ -8792,23 +8792,21 @@
           <w:rFonts w:cs="Times New Roman"/>
           <w:color w:val="000000" w:themeColor="text1"/>
         </w:rPr>
-        <w:t xml:space="preserve">) disponibles por los administradores de información. Estas </w:t>
-      </w:r>
-      <w:proofErr w:type="spellStart"/>
-      <w:r>
-        <w:rPr>
-          <w:rFonts w:cs="Times New Roman"/>
-          <w:color w:val="000000" w:themeColor="text1"/>
-        </w:rPr>
-        <w:t>APIs</w:t>
-      </w:r>
-      <w:proofErr w:type="spellEnd"/>
-      <w:r>
-        <w:rPr>
-          <w:rFonts w:cs="Times New Roman"/>
-          <w:color w:val="000000" w:themeColor="text1"/>
-        </w:rPr>
-        <w:t xml:space="preserve"> funcionan como </w:t>
+        <w:t>) disponibles por los administradores de información</w:t>
+      </w:r>
+      <w:r>
+        <w:rPr>
+          <w:rFonts w:cs="Times New Roman"/>
+          <w:color w:val="000000" w:themeColor="text1"/>
+        </w:rPr>
+        <w:t xml:space="preserve">, que </w:t>
+      </w:r>
+      <w:r>
+        <w:rPr>
+          <w:rFonts w:cs="Times New Roman"/>
+          <w:color w:val="000000" w:themeColor="text1"/>
+        </w:rPr>
+        <w:t xml:space="preserve">funcionan como </w:t>
       </w:r>
       <w:r>
         <w:rPr>
@@ -8882,6 +8880,40 @@
     </w:p>
     <w:p>
       <w:pPr>
+        <w:ind w:firstLine="0"/>
+        <w:jc w:val="both"/>
+        <w:rPr>
+          <w:rFonts w:cs="Times New Roman"/>
+          <w:color w:val="000000" w:themeColor="text1"/>
+        </w:rPr>
+      </w:pPr>
+    </w:p>
+    <w:p>
+      <w:pPr>
+        <w:ind w:firstLine="0"/>
+        <w:jc w:val="both"/>
+        <w:rPr>
+          <w:rFonts w:cs="Times New Roman"/>
+          <w:color w:val="000000" w:themeColor="text1"/>
+        </w:rPr>
+      </w:pPr>
+      <w:r>
+        <w:rPr>
+          <w:rFonts w:cs="Times New Roman"/>
+          <w:color w:val="000000" w:themeColor="text1"/>
+        </w:rPr>
+        <w:t>¿Apéndice I?</w:t>
+      </w:r>
+      <w:r>
+        <w:rPr>
+          <w:rFonts w:cs="Times New Roman"/>
+          <w:color w:val="000000" w:themeColor="text1"/>
+        </w:rPr>
+        <w:t xml:space="preserve"> Breve espacio técnico con lógica de construcción de interfaz hacia la API y almacenamiento de datos.</w:t>
+      </w:r>
+    </w:p>
+    <w:p>
+      <w:pPr>
         <w:pStyle w:val="Ttulo2"/>
         <w:ind w:firstLine="0"/>
         <w:rPr>
@@ -8899,11 +8931,684 @@
     </w:p>
     <w:p>
       <w:pPr>
-        <w:ind w:firstLine="0"/>
-      </w:pPr>
+        <w:jc w:val="both"/>
+      </w:pPr>
+      <w:r>
+        <w:t xml:space="preserve">Los datos meteorológicos que se reciben de los productos ERA5 no requieren tratamiento ya que son datos preprocesados por los modelos mencionados en el apartado </w:t>
+      </w:r>
+      <w:r>
+        <w:t>anterior. Las transformaciones en los datos están sujetas a obtener los valores base que sirvan como entrada para la determinación de las variables derivadas o calculadas del FWI (</w:t>
+      </w:r>
+      <w:proofErr w:type="spellStart"/>
+      <w:r>
+        <w:t>Fire</w:t>
+      </w:r>
+      <w:proofErr w:type="spellEnd"/>
+      <w:r>
+        <w:t xml:space="preserve"> </w:t>
+      </w:r>
+      <w:proofErr w:type="spellStart"/>
+      <w:r>
+        <w:t>Weather</w:t>
+      </w:r>
+      <w:proofErr w:type="spellEnd"/>
+      <w:r>
+        <w:t xml:space="preserve"> </w:t>
+      </w:r>
+      <w:proofErr w:type="spellStart"/>
+      <w:r>
+        <w:t>Index</w:t>
+      </w:r>
+      <w:proofErr w:type="spellEnd"/>
+      <w:r>
+        <w:t xml:space="preserve">) </w:t>
+      </w:r>
+      <w:r>
+        <w:fldChar w:fldCharType="begin"/>
+      </w:r>
+      <w:r>
+        <w:instrText xml:space="preserve"> REF _Ref212113708 \r \h </w:instrText>
+      </w:r>
+      <w:r>
+        <w:instrText xml:space="preserve"> \* MERGEFORMAT </w:instrText>
+      </w:r>
+      <w:r>
+        <w:fldChar w:fldCharType="separate"/>
+      </w:r>
+      <w:r>
+        <w:t>[16]</w:t>
+      </w:r>
+      <w:r>
+        <w:fldChar w:fldCharType="end"/>
+      </w:r>
+      <w:r>
+        <w:t>.</w:t>
+      </w:r>
     </w:p>
     <w:p>
       <w:pPr>
+        <w:pStyle w:val="Ttulo3"/>
+        <w:ind w:firstLine="0"/>
+        <w:jc w:val="both"/>
+      </w:pPr>
+      <w:proofErr w:type="spellStart"/>
+      <w:r>
+        <w:rPr>
+          <w:color w:val="000000" w:themeColor="text1"/>
+        </w:rPr>
+        <w:t>Fire</w:t>
+      </w:r>
+      <w:proofErr w:type="spellEnd"/>
+      <w:r>
+        <w:rPr>
+          <w:color w:val="000000" w:themeColor="text1"/>
+        </w:rPr>
+        <w:t xml:space="preserve"> </w:t>
+      </w:r>
+      <w:proofErr w:type="spellStart"/>
+      <w:r>
+        <w:rPr>
+          <w:color w:val="000000" w:themeColor="text1"/>
+        </w:rPr>
+        <w:t>W</w:t>
+      </w:r>
+      <w:r>
+        <w:rPr>
+          <w:color w:val="000000" w:themeColor="text1"/>
+        </w:rPr>
+        <w:t>eather</w:t>
+      </w:r>
+      <w:proofErr w:type="spellEnd"/>
+      <w:r>
+        <w:rPr>
+          <w:color w:val="000000" w:themeColor="text1"/>
+        </w:rPr>
+        <w:t xml:space="preserve"> </w:t>
+      </w:r>
+      <w:proofErr w:type="spellStart"/>
+      <w:r>
+        <w:rPr>
+          <w:color w:val="000000" w:themeColor="text1"/>
+        </w:rPr>
+        <w:t>I</w:t>
+      </w:r>
+      <w:r>
+        <w:rPr>
+          <w:color w:val="000000" w:themeColor="text1"/>
+        </w:rPr>
+        <w:t>ndex</w:t>
+      </w:r>
+      <w:proofErr w:type="spellEnd"/>
+    </w:p>
+    <w:p>
+      <w:pPr>
+        <w:ind w:firstLine="708"/>
+        <w:jc w:val="both"/>
+      </w:pPr>
+      <w:r>
+        <w:t xml:space="preserve">El </w:t>
+      </w:r>
+      <w:r>
+        <w:t>s</w:t>
+      </w:r>
+      <w:r>
+        <w:t xml:space="preserve">istema canadiense de índice meteorológico de incendios forestales consta de seis componentes que explican los efectos de la humedad del combustible y </w:t>
+      </w:r>
+      <w:r>
+        <w:t>c</w:t>
+      </w:r>
+      <w:r>
+        <w:t>ondiciones climáticas sobre el comportamiento del fuego.</w:t>
+      </w:r>
+    </w:p>
+    <w:p>
+      <w:pPr>
+        <w:ind w:firstLine="708"/>
+        <w:jc w:val="both"/>
+      </w:pPr>
+    </w:p>
+    <w:p>
+      <w:pPr>
+        <w:ind w:firstLine="708"/>
+        <w:jc w:val="both"/>
+      </w:pPr>
+      <w:r>
+        <w:t xml:space="preserve">Los primeros tres componentes </w:t>
+      </w:r>
+      <w:r>
+        <w:t xml:space="preserve">(FFMC, DMC, DC) </w:t>
+      </w:r>
+      <w:r>
+        <w:t xml:space="preserve">son </w:t>
+      </w:r>
+      <w:r>
+        <w:t>c</w:t>
+      </w:r>
+      <w:r>
+        <w:t xml:space="preserve">lasificaciones numéricas </w:t>
+      </w:r>
+      <w:r>
+        <w:t>del</w:t>
+      </w:r>
+      <w:r>
+        <w:t xml:space="preserve"> contenido de humedad del suelo y otras materias orgánicas muertas</w:t>
+      </w:r>
+      <w:r>
+        <w:t xml:space="preserve"> cuyos</w:t>
+      </w:r>
+      <w:r>
+        <w:t xml:space="preserve"> valores aumentan a medida que disminuye el contenido de humedad</w:t>
+      </w:r>
+      <w:r>
+        <w:t>:</w:t>
+      </w:r>
+    </w:p>
+    <w:p>
+      <w:pPr>
+        <w:pStyle w:val="Prrafodelista"/>
+        <w:numPr>
+          <w:ilvl w:val="0"/>
+          <w:numId w:val="5"/>
+        </w:numPr>
+        <w:ind w:firstLine="0"/>
+        <w:jc w:val="both"/>
+      </w:pPr>
+      <w:proofErr w:type="spellStart"/>
+      <w:r>
+        <w:rPr>
+          <w:b/>
+          <w:bCs/>
+        </w:rPr>
+        <w:lastRenderedPageBreak/>
+        <w:t>Fire</w:t>
+      </w:r>
+      <w:proofErr w:type="spellEnd"/>
+      <w:r>
+        <w:rPr>
+          <w:b/>
+          <w:bCs/>
+        </w:rPr>
+        <w:t xml:space="preserve"> </w:t>
+      </w:r>
+      <w:r>
+        <w:rPr>
+          <w:b/>
+          <w:bCs/>
+        </w:rPr>
+        <w:t>F</w:t>
+      </w:r>
+      <w:r>
+        <w:rPr>
+          <w:b/>
+          <w:bCs/>
+        </w:rPr>
+        <w:t xml:space="preserve">uel </w:t>
+      </w:r>
+      <w:proofErr w:type="spellStart"/>
+      <w:r>
+        <w:rPr>
+          <w:b/>
+          <w:bCs/>
+        </w:rPr>
+        <w:t>M</w:t>
+      </w:r>
+      <w:r>
+        <w:rPr>
+          <w:b/>
+          <w:bCs/>
+        </w:rPr>
+        <w:t>oisture</w:t>
+      </w:r>
+      <w:proofErr w:type="spellEnd"/>
+      <w:r>
+        <w:rPr>
+          <w:b/>
+          <w:bCs/>
+        </w:rPr>
+        <w:t xml:space="preserve"> </w:t>
+      </w:r>
+      <w:proofErr w:type="spellStart"/>
+      <w:r>
+        <w:rPr>
+          <w:b/>
+          <w:bCs/>
+        </w:rPr>
+        <w:t>C</w:t>
+      </w:r>
+      <w:r>
+        <w:rPr>
+          <w:b/>
+          <w:bCs/>
+        </w:rPr>
+        <w:t>ode</w:t>
+      </w:r>
+      <w:proofErr w:type="spellEnd"/>
+      <w:r>
+        <w:rPr>
+          <w:b/>
+          <w:bCs/>
+        </w:rPr>
+        <w:t xml:space="preserve"> (FFMC)</w:t>
+      </w:r>
+      <w:r>
+        <w:t>,</w:t>
+      </w:r>
+      <w:r>
+        <w:t xml:space="preserve"> es una clasificación numérica de la humedad contenido de basura y otros combustibles finos curados. </w:t>
+      </w:r>
+      <w:r>
+        <w:t>I</w:t>
+      </w:r>
+      <w:r>
+        <w:t xml:space="preserve">ndicador de la facilidad de ignición </w:t>
+      </w:r>
+      <w:r>
+        <w:t>e</w:t>
+      </w:r>
+      <w:r>
+        <w:t xml:space="preserve"> </w:t>
+      </w:r>
+      <w:r>
+        <w:t>i</w:t>
+      </w:r>
+      <w:r>
+        <w:t>nflamabilidad del combustible fino.</w:t>
+      </w:r>
+    </w:p>
+    <w:p>
+      <w:pPr>
+        <w:pStyle w:val="Prrafodelista"/>
+        <w:numPr>
+          <w:ilvl w:val="0"/>
+          <w:numId w:val="5"/>
+        </w:numPr>
+        <w:ind w:firstLine="0"/>
+        <w:jc w:val="both"/>
+      </w:pPr>
+      <w:proofErr w:type="spellStart"/>
+      <w:r>
+        <w:rPr>
+          <w:b/>
+          <w:bCs/>
+        </w:rPr>
+        <w:t>Duff</w:t>
+      </w:r>
+      <w:proofErr w:type="spellEnd"/>
+      <w:r>
+        <w:rPr>
+          <w:b/>
+          <w:bCs/>
+        </w:rPr>
+        <w:t xml:space="preserve"> </w:t>
+      </w:r>
+      <w:proofErr w:type="spellStart"/>
+      <w:r>
+        <w:rPr>
+          <w:b/>
+          <w:bCs/>
+        </w:rPr>
+        <w:t>Moisture</w:t>
+      </w:r>
+      <w:proofErr w:type="spellEnd"/>
+      <w:r>
+        <w:rPr>
+          <w:b/>
+          <w:bCs/>
+        </w:rPr>
+        <w:t xml:space="preserve"> </w:t>
+      </w:r>
+      <w:proofErr w:type="spellStart"/>
+      <w:r>
+        <w:rPr>
+          <w:b/>
+          <w:bCs/>
+        </w:rPr>
+        <w:t>Code</w:t>
+      </w:r>
+      <w:proofErr w:type="spellEnd"/>
+      <w:r>
+        <w:rPr>
+          <w:b/>
+          <w:bCs/>
+        </w:rPr>
+        <w:t xml:space="preserve"> (DMC)</w:t>
+      </w:r>
+      <w:r>
+        <w:t>,</w:t>
+      </w:r>
+      <w:r>
+        <w:t xml:space="preserve"> </w:t>
+      </w:r>
+      <w:r>
+        <w:t xml:space="preserve">es una clasificación numérica de la humedad promedio contenido de capas orgánicas poco compactadas de profundidad moderada. </w:t>
+      </w:r>
+      <w:r>
+        <w:rPr>
+          <w:lang w:val="es-ES"/>
+        </w:rPr>
+        <w:t>Indicador d</w:t>
+      </w:r>
+      <w:r>
+        <w:rPr>
+          <w:lang w:val="es-ES"/>
+        </w:rPr>
+        <w:t>el consumo de combustible en capas moderadas de hojarasca y material leñoso de tamaño mediano</w:t>
+      </w:r>
+      <w:r>
+        <w:rPr>
+          <w:lang w:val="es-ES"/>
+        </w:rPr>
+        <w:t>.</w:t>
+      </w:r>
+    </w:p>
+    <w:p>
+      <w:pPr>
+        <w:pStyle w:val="Prrafodelista"/>
+        <w:numPr>
+          <w:ilvl w:val="0"/>
+          <w:numId w:val="5"/>
+        </w:numPr>
+        <w:ind w:firstLine="0"/>
+        <w:jc w:val="both"/>
+      </w:pPr>
+      <w:proofErr w:type="spellStart"/>
+      <w:r>
+        <w:rPr>
+          <w:b/>
+          <w:bCs/>
+        </w:rPr>
+        <w:t>Drought</w:t>
+      </w:r>
+      <w:proofErr w:type="spellEnd"/>
+      <w:r>
+        <w:rPr>
+          <w:b/>
+          <w:bCs/>
+        </w:rPr>
+        <w:t xml:space="preserve"> </w:t>
+      </w:r>
+      <w:proofErr w:type="spellStart"/>
+      <w:r>
+        <w:rPr>
+          <w:b/>
+          <w:bCs/>
+        </w:rPr>
+        <w:t>Code</w:t>
+      </w:r>
+      <w:proofErr w:type="spellEnd"/>
+      <w:r>
+        <w:rPr>
+          <w:b/>
+          <w:bCs/>
+        </w:rPr>
+        <w:t xml:space="preserve"> (DC)</w:t>
+      </w:r>
+      <w:r>
+        <w:t>,</w:t>
+      </w:r>
+      <w:r>
+        <w:t xml:space="preserve"> es una calificación numérica del contenido promedio de humedad de capas orgánicas profundas y compactas. </w:t>
+      </w:r>
+      <w:r>
+        <w:rPr>
+          <w:lang w:val="es-ES"/>
+        </w:rPr>
+        <w:t>I</w:t>
+      </w:r>
+      <w:r>
+        <w:rPr>
+          <w:lang w:val="es-ES"/>
+        </w:rPr>
+        <w:t>ndicador útil de los efectos de la sequía estacional en los combustibles forestales y la cantidad de combustión latente en capas profundas de mantillo y troncos grandes.</w:t>
+      </w:r>
+    </w:p>
+    <w:p>
+      <w:pPr>
+        <w:ind w:firstLine="708"/>
+        <w:jc w:val="both"/>
+      </w:pPr>
+    </w:p>
+    <w:p>
+      <w:pPr>
+        <w:ind w:firstLine="708"/>
+        <w:jc w:val="both"/>
+      </w:pPr>
+      <w:r>
+        <w:t xml:space="preserve">Los tres componentes restantes (ISI, BUI, FWI) son índices de comportamiento del fuego, que representan la tasa de la propagación del fuego, el combustible disponible para </w:t>
+      </w:r>
+      <w:r>
+        <w:t>la</w:t>
+      </w:r>
+      <w:r>
+        <w:t xml:space="preserve"> combustión y la intensidad del fuego frontal; estos tres valores aumentan a medida que aumenta el peligro de incendio</w:t>
+      </w:r>
+      <w:r>
+        <w:t>:</w:t>
+      </w:r>
+    </w:p>
+    <w:p>
+      <w:pPr>
+        <w:pStyle w:val="Prrafodelista"/>
+        <w:numPr>
+          <w:ilvl w:val="0"/>
+          <w:numId w:val="5"/>
+        </w:numPr>
+        <w:ind w:firstLine="0"/>
+        <w:jc w:val="both"/>
+      </w:pPr>
+      <w:proofErr w:type="spellStart"/>
+      <w:r>
+        <w:rPr>
+          <w:b/>
+          <w:bCs/>
+        </w:rPr>
+        <w:t>Initial</w:t>
+      </w:r>
+      <w:proofErr w:type="spellEnd"/>
+      <w:r>
+        <w:rPr>
+          <w:b/>
+          <w:bCs/>
+        </w:rPr>
+        <w:t xml:space="preserve"> Spread </w:t>
+      </w:r>
+      <w:proofErr w:type="spellStart"/>
+      <w:r>
+        <w:rPr>
+          <w:b/>
+          <w:bCs/>
+        </w:rPr>
+        <w:t>Index</w:t>
+      </w:r>
+      <w:proofErr w:type="spellEnd"/>
+      <w:r>
+        <w:rPr>
+          <w:b/>
+          <w:bCs/>
+        </w:rPr>
+        <w:t xml:space="preserve"> (ISI)</w:t>
+      </w:r>
+      <w:r>
+        <w:t xml:space="preserve">, </w:t>
+      </w:r>
+      <w:r>
+        <w:t xml:space="preserve">es una </w:t>
+      </w:r>
+      <w:r>
+        <w:t>clasificación numérica de la velocidad de propagación prevista del incendio</w:t>
+      </w:r>
+      <w:r>
+        <w:t xml:space="preserve">. Se basa en la velocidad del viento y FFMC. </w:t>
+      </w:r>
+      <w:r>
+        <w:t>Al igual que el resto de los componentes del sistema FWI, no considera el tipo de combustible. Las velocidades de propagación reales varían según el tipo de combustible con el mismo ISI.</w:t>
+      </w:r>
+    </w:p>
+    <w:p>
+      <w:pPr>
+        <w:pStyle w:val="Prrafodelista"/>
+        <w:numPr>
+          <w:ilvl w:val="0"/>
+          <w:numId w:val="5"/>
+        </w:numPr>
+        <w:ind w:firstLine="0"/>
+        <w:jc w:val="both"/>
+      </w:pPr>
+      <w:proofErr w:type="spellStart"/>
+      <w:r>
+        <w:rPr>
+          <w:b/>
+          <w:bCs/>
+        </w:rPr>
+        <w:t>Buildup</w:t>
+      </w:r>
+      <w:proofErr w:type="spellEnd"/>
+      <w:r>
+        <w:rPr>
+          <w:b/>
+          <w:bCs/>
+        </w:rPr>
+        <w:t xml:space="preserve"> </w:t>
+      </w:r>
+      <w:proofErr w:type="spellStart"/>
+      <w:r>
+        <w:rPr>
+          <w:b/>
+          <w:bCs/>
+        </w:rPr>
+        <w:t>Index</w:t>
+      </w:r>
+      <w:proofErr w:type="spellEnd"/>
+      <w:r>
+        <w:rPr>
+          <w:b/>
+          <w:bCs/>
+        </w:rPr>
+        <w:t xml:space="preserve"> (BUI)</w:t>
+      </w:r>
+      <w:r>
+        <w:t>,</w:t>
+      </w:r>
+      <w:r>
+        <w:t xml:space="preserve"> es una </w:t>
+      </w:r>
+      <w:r>
+        <w:t>clasificación numérica de la cantidad total de combustible disponible para la combustión</w:t>
+      </w:r>
+      <w:r>
+        <w:t xml:space="preserve">. Se basa en el DMC y el DC. </w:t>
+      </w:r>
+      <w:r>
+        <w:t>suele ser menos del doble del valor del DMC, y se espera que la humedad en la capa de DMC ayude a prevenir la combustión del material en las capas más profundas del combustible disponible</w:t>
+      </w:r>
+      <w:r>
+        <w:t>.</w:t>
+      </w:r>
+    </w:p>
+    <w:p>
+      <w:pPr>
+        <w:pStyle w:val="Prrafodelista"/>
+        <w:numPr>
+          <w:ilvl w:val="0"/>
+          <w:numId w:val="5"/>
+        </w:numPr>
+        <w:ind w:firstLine="0"/>
+        <w:jc w:val="both"/>
+      </w:pPr>
+      <w:proofErr w:type="spellStart"/>
+      <w:r>
+        <w:rPr>
+          <w:b/>
+          <w:bCs/>
+        </w:rPr>
+        <w:t>Fire</w:t>
+      </w:r>
+      <w:proofErr w:type="spellEnd"/>
+      <w:r>
+        <w:rPr>
+          <w:b/>
+          <w:bCs/>
+        </w:rPr>
+        <w:t xml:space="preserve"> </w:t>
+      </w:r>
+      <w:proofErr w:type="spellStart"/>
+      <w:r>
+        <w:rPr>
+          <w:b/>
+          <w:bCs/>
+        </w:rPr>
+        <w:t>Weather</w:t>
+      </w:r>
+      <w:proofErr w:type="spellEnd"/>
+      <w:r>
+        <w:rPr>
+          <w:b/>
+          <w:bCs/>
+        </w:rPr>
+        <w:t xml:space="preserve"> </w:t>
+      </w:r>
+      <w:proofErr w:type="spellStart"/>
+      <w:r>
+        <w:rPr>
+          <w:b/>
+          <w:bCs/>
+        </w:rPr>
+        <w:t>Index</w:t>
+      </w:r>
+      <w:proofErr w:type="spellEnd"/>
+      <w:r>
+        <w:rPr>
+          <w:b/>
+          <w:bCs/>
+        </w:rPr>
+        <w:t xml:space="preserve"> (FWI)</w:t>
+      </w:r>
+      <w:r>
+        <w:t>,</w:t>
+      </w:r>
+      <w:r>
+        <w:t xml:space="preserve"> es una </w:t>
+      </w:r>
+      <w:r>
+        <w:t>clasificación</w:t>
+      </w:r>
+      <w:r>
+        <w:t xml:space="preserve"> numérica de la intensidad de los incendios.</w:t>
+      </w:r>
+      <w:r>
+        <w:t xml:space="preserve"> </w:t>
+      </w:r>
+      <w:r>
+        <w:t>Se basa en el ISI y el BUI, y se utiliza como índice general de peligro de incendio en las zonas forestales de Canadá</w:t>
+      </w:r>
+      <w:r>
+        <w:t>.</w:t>
+      </w:r>
+    </w:p>
+    <w:p>
+      <w:pPr>
+        <w:ind w:left="720" w:firstLine="0"/>
+        <w:jc w:val="both"/>
+      </w:pPr>
+    </w:p>
+    <w:p>
+      <w:pPr>
+        <w:ind w:firstLine="0"/>
+      </w:pPr>
+      <w:r>
+        <w:t>¿Apéndice II?</w:t>
+      </w:r>
+      <w:r>
+        <w:t xml:space="preserve"> Espacio técnico con el detalle de cálculos/formulas y su implementación para obtener los campos calculados.</w:t>
+      </w:r>
+    </w:p>
+    <w:p>
+      <w:pPr>
+        <w:ind w:firstLine="0"/>
+      </w:pPr>
+    </w:p>
+    <w:p>
+      <w:pPr>
         <w:pStyle w:val="Ttulo2"/>
         <w:ind w:firstLine="0"/>
         <w:rPr>
@@ -8919,6 +9624,7 @@
         <w:t>Tratamiento de datos de focos de calor</w:t>
       </w:r>
     </w:p>
+    <w:p/>
     <w:p>
       <w:pPr>
         <w:pStyle w:val="Ttulo1"/>
@@ -8934,6 +9640,7 @@
           <w:rFonts w:ascii="Times New Roman" w:hAnsi="Times New Roman" w:cs="Times New Roman"/>
           <w:color w:val="000000" w:themeColor="text1"/>
         </w:rPr>
+        <w:lastRenderedPageBreak/>
         <w:t>Análisis exploratorio</w:t>
       </w:r>
       <w:bookmarkEnd w:id="6"/>
@@ -9018,7 +9725,6 @@
           <w:rFonts w:ascii="Times New Roman" w:hAnsi="Times New Roman" w:cs="Times New Roman"/>
           <w:color w:val="000000" w:themeColor="text1"/>
         </w:rPr>
-        <w:lastRenderedPageBreak/>
         <w:t>Conclusiones</w:t>
       </w:r>
       <w:bookmarkEnd w:id="9"/>
@@ -10505,6 +11211,119 @@
         <w:t xml:space="preserve"> (EOSDIS).</w:t>
       </w:r>
       <w:bookmarkEnd w:id="26"/>
+    </w:p>
+    <w:p>
+      <w:pPr>
+        <w:pStyle w:val="Prrafodelista"/>
+        <w:numPr>
+          <w:ilvl w:val="0"/>
+          <w:numId w:val="1"/>
+        </w:numPr>
+      </w:pPr>
+      <w:bookmarkStart w:id="27" w:name="_Ref212113708"/>
+      <w:proofErr w:type="spellStart"/>
+      <w:proofErr w:type="gramStart"/>
+      <w:r>
+        <w:t>Wagner,C</w:t>
+      </w:r>
+      <w:proofErr w:type="spellEnd"/>
+      <w:r>
+        <w:t>.</w:t>
+      </w:r>
+      <w:proofErr w:type="gramEnd"/>
+      <w:r>
+        <w:t xml:space="preserve"> E. van</w:t>
+      </w:r>
+      <w:r>
+        <w:t xml:space="preserve">, ISBN: </w:t>
+      </w:r>
+      <w:r>
+        <w:t xml:space="preserve">0-662-15198-4, Canadian </w:t>
+      </w:r>
+      <w:proofErr w:type="spellStart"/>
+      <w:r>
+        <w:t>Forestry</w:t>
+      </w:r>
+      <w:proofErr w:type="spellEnd"/>
+      <w:r>
+        <w:t xml:space="preserve"> </w:t>
+      </w:r>
+      <w:proofErr w:type="spellStart"/>
+      <w:r>
+        <w:t>Service</w:t>
+      </w:r>
+      <w:proofErr w:type="spellEnd"/>
+      <w:r>
+        <w:t xml:space="preserve">, </w:t>
+      </w:r>
+      <w:proofErr w:type="spellStart"/>
+      <w:r>
+        <w:t>Development</w:t>
+      </w:r>
+      <w:proofErr w:type="spellEnd"/>
+      <w:r>
+        <w:t xml:space="preserve"> and </w:t>
+      </w:r>
+      <w:proofErr w:type="spellStart"/>
+      <w:r>
+        <w:t>structure</w:t>
+      </w:r>
+      <w:proofErr w:type="spellEnd"/>
+      <w:r>
+        <w:t xml:space="preserve"> </w:t>
+      </w:r>
+      <w:proofErr w:type="spellStart"/>
+      <w:r>
+        <w:t>of</w:t>
+      </w:r>
+      <w:proofErr w:type="spellEnd"/>
+      <w:r>
+        <w:t xml:space="preserve"> </w:t>
+      </w:r>
+      <w:proofErr w:type="spellStart"/>
+      <w:r>
+        <w:t>the</w:t>
+      </w:r>
+      <w:proofErr w:type="spellEnd"/>
+      <w:r>
+        <w:t xml:space="preserve"> Canadian Forest </w:t>
+      </w:r>
+      <w:proofErr w:type="spellStart"/>
+      <w:r>
+        <w:t>Fire</w:t>
+      </w:r>
+      <w:proofErr w:type="spellEnd"/>
+      <w:r>
+        <w:t xml:space="preserve"> </w:t>
+      </w:r>
+      <w:proofErr w:type="spellStart"/>
+      <w:r>
+        <w:t>Weather</w:t>
+      </w:r>
+      <w:proofErr w:type="spellEnd"/>
+      <w:r>
+        <w:t xml:space="preserve"> </w:t>
+      </w:r>
+      <w:proofErr w:type="spellStart"/>
+      <w:r>
+        <w:t>Index</w:t>
+      </w:r>
+      <w:proofErr w:type="spellEnd"/>
+      <w:r>
+        <w:t xml:space="preserve"> </w:t>
+      </w:r>
+      <w:proofErr w:type="spellStart"/>
+      <w:r>
+        <w:t>System</w:t>
+      </w:r>
+      <w:proofErr w:type="spellEnd"/>
+      <w:r>
+        <w:t>, (1987)</w:t>
+      </w:r>
+      <w:r>
+        <w:t>.</w:t>
+      </w:r>
+      <w:bookmarkEnd w:id="27"/>
     </w:p>
     <w:p>
       <w:pPr>
@@ -12292,6 +13111,36 @@
       <w:ind w:left="220"/>
     </w:pPr>
   </w:style>
+  <w:style w:type="paragraph" w:styleId="HTMLconformatoprevio">
+    <w:name w:val="HTML Preformatted"/>
+    <w:basedOn w:val="Normal"/>
+    <w:link w:val="HTMLconformatoprevioCar"/>
+    <w:uiPriority w:val="99"/>
+    <w:semiHidden/>
+    <w:unhideWhenUsed/>
+    <w:rsid w:val="00E35A15"/>
+    <w:pPr>
+      <w:spacing w:line="240" w:lineRule="auto"/>
+    </w:pPr>
+    <w:rPr>
+      <w:rFonts w:ascii="Consolas" w:hAnsi="Consolas"/>
+      <w:sz w:val="20"/>
+      <w:szCs w:val="20"/>
+    </w:rPr>
+  </w:style>
+  <w:style w:type="character" w:customStyle="1" w:styleId="HTMLconformatoprevioCar">
+    <w:name w:val="HTML con formato previo Car"/>
+    <w:basedOn w:val="Fuentedeprrafopredeter"/>
+    <w:link w:val="HTMLconformatoprevio"/>
+    <w:uiPriority w:val="99"/>
+    <w:semiHidden/>
+    <w:rsid w:val="00E35A15"/>
+    <w:rPr>
+      <w:rFonts w:ascii="Consolas" w:hAnsi="Consolas"/>
+      <w:sz w:val="20"/>
+      <w:szCs w:val="20"/>
+    </w:rPr>
+  </w:style>
 </w:styles>
 </file>
 

</xml_diff>

<commit_message>
Update: Preparación de presentación avance.
</commit_message>
<xml_diff>
--- a/docs/Tesis - Villagra Turco, Ezequiel.docx
+++ b/docs/Tesis - Villagra Turco, Ezequiel.docx
@@ -278,7 +278,7 @@
         <w:jc w:val="both"/>
       </w:pPr>
       <w:r>
-        <w:t>Esta tesis implementa un proceso automatizado, flexible y escalable para la recolección y procesamiento de datos satelitales, con el objetivo de consolidar un conjunto de datos integral para el estudio de incendios forestales. El propósito central del estudio es implementar y evaluar modelos predictivos de aprendizaje automático que estimen la probabilidad de ocurrencia de incendios forestales basándose en condiciones meteorológicas y variables ambientales de una región específica. [SIGUE…]</w:t>
+        <w:t>Esta tesis implementa un proceso automatizado, flexible y escalable para la recolección y procesamiento de datos, con el objetivo de consolidar un conjunto de datos integral para el estudio de incendios forestales. El propósito central del estudio es implementar y evaluar modelos predictivos de aprendizaje automático que estimen la probabilidad de ocurrencia de incendios forestales basándose en condiciones meteorológicas y variables ambientales de una región específica. [SIGUE…]</w:t>
       </w:r>
       <w:r>
         <w:t>.</w:t>
@@ -1306,23 +1306,7 @@
                 <w:rFonts w:cs="Times New Roman"/>
                 <w:noProof/>
               </w:rPr>
-              <w:t xml:space="preserve">Análisis </w:t>
-            </w:r>
-            <w:r>
-              <w:rPr>
-                <w:rStyle w:val="Hipervnculo"/>
-                <w:rFonts w:cs="Times New Roman"/>
-                <w:noProof/>
-              </w:rPr>
-              <w:t>e</w:t>
-            </w:r>
-            <w:r>
-              <w:rPr>
-                <w:rStyle w:val="Hipervnculo"/>
-                <w:rFonts w:cs="Times New Roman"/>
-                <w:noProof/>
-              </w:rPr>
-              <w:t>xploratorio</w:t>
+              <w:t>Análisis exploratorio</w:t>
             </w:r>
             <w:r>
               <w:rPr>
@@ -9345,7 +9329,25 @@
         <w:jc w:val="both"/>
       </w:pPr>
       <w:r>
-        <w:t xml:space="preserve">Los datos meteorológicos recibidos de los productos ERA5-Land [12] son un producto de reanálisis, por lo que no requieren limpieza o </w:t>
+        <w:t xml:space="preserve">Los datos meteorológicos recibidos de los productos ERA5-Land </w:t>
+      </w:r>
+      <w:r>
+        <w:fldChar w:fldCharType="begin"/>
+      </w:r>
+      <w:r>
+        <w:instrText xml:space="preserve"> REF _Ref212572650 \r \h </w:instrText>
+      </w:r>
+      <w:r>
+        <w:fldChar w:fldCharType="separate"/>
+      </w:r>
+      <w:r>
+        <w:t>[12]</w:t>
+      </w:r>
+      <w:r>
+        <w:fldChar w:fldCharType="end"/>
+      </w:r>
+      <w:r>
+        <w:t xml:space="preserve"> son un producto de reanálisis, por lo que no requieren limpieza o </w:t>
       </w:r>
       <w:r>
         <w:t>revisión</w:t>
@@ -10379,7 +10381,13 @@
       </w:r>
       <w:proofErr w:type="spellEnd"/>
       <w:r>
-        <w:t xml:space="preserve"> se observó un problema de discontinuidad temporal en las variables de incendios (</w:t>
+        <w:t xml:space="preserve"> se observó un problema de discontinuidad temporal en las variables de </w:t>
+      </w:r>
+      <w:r>
+        <w:t>focos de calor</w:t>
+      </w:r>
+      <w:r>
+        <w:t xml:space="preserve"> (</w:t>
       </w:r>
       <w:proofErr w:type="spellStart"/>
       <w:r>
@@ -10654,10 +10662,10 @@
         <w:jc w:val="both"/>
       </w:pPr>
       <w:r>
-        <w:t xml:space="preserve">Predictores Meteorológicos: El conjunto de las 6 variables del </w:t>
-      </w:r>
-      <w:r>
-        <w:t>FWI.</w:t>
+        <w:t xml:space="preserve">Predictores Meteorológicos: </w:t>
+      </w:r>
+      <w:r>
+        <w:t>Información meteorológica más el conjunto de las 6 variables del FWI.</w:t>
       </w:r>
     </w:p>
     <w:p>
@@ -10762,7 +10770,7 @@
           <w:rFonts w:cs="Times New Roman"/>
           <w:color w:val="000000" w:themeColor="text1"/>
         </w:rPr>
-        <w:t xml:space="preserve"> se verificó la información relacionada a la geolocalización con un resumen métrico de la grilla y la distribución de frecuencias por coordenadas, </w:t>
+        <w:t xml:space="preserve"> se verificó la información relacionada a la geolocalización con un resumen de la grilla y la distribución de frecuencias por coordenadas, </w:t>
       </w:r>
       <w:r>
         <w:rPr>
@@ -11038,35 +11046,7 @@
                 <w:lang w:eastAsia="es-AR"/>
                 <w14:ligatures w14:val="none"/>
               </w:rPr>
-              <w:t>Total</w:t>
-            </w:r>
-            <w:r>
-              <w:rPr>
-                <w:rFonts w:eastAsia="Times New Roman" w:cs="Times New Roman"/>
-                <w:i/>
-                <w:iCs/>
-                <w:color w:val="000000"/>
-                <w:kern w:val="0"/>
-                <w:sz w:val="18"/>
-                <w:szCs w:val="18"/>
-                <w:lang w:eastAsia="es-AR"/>
-                <w14:ligatures w14:val="none"/>
-              </w:rPr>
-              <w:t>,</w:t>
-            </w:r>
-            <w:r>
-              <w:rPr>
-                <w:rFonts w:eastAsia="Times New Roman" w:cs="Times New Roman"/>
-                <w:i/>
-                <w:iCs/>
-                <w:color w:val="000000"/>
-                <w:kern w:val="0"/>
-                <w:sz w:val="18"/>
-                <w:szCs w:val="18"/>
-                <w:lang w:eastAsia="es-AR"/>
-                <w14:ligatures w14:val="none"/>
-              </w:rPr>
-              <w:t xml:space="preserve"> celdas</w:t>
+              <w:t>Total, celdas</w:t>
             </w:r>
           </w:p>
         </w:tc>
@@ -11890,25 +11870,7 @@
           <w:bCs/>
           <w:color w:val="000000" w:themeColor="text1"/>
         </w:rPr>
-        <w:t xml:space="preserve"> - Validación </w:t>
-      </w:r>
-      <w:proofErr w:type="spellStart"/>
-      <w:r>
-        <w:rPr>
-          <w:b/>
-          <w:bCs/>
-          <w:color w:val="000000" w:themeColor="text1"/>
-        </w:rPr>
-        <w:t>curzada</w:t>
-      </w:r>
-      <w:proofErr w:type="spellEnd"/>
-      <w:r>
-        <w:rPr>
-          <w:b/>
-          <w:bCs/>
-          <w:color w:val="000000" w:themeColor="text1"/>
-        </w:rPr>
-        <w:t xml:space="preserve"> con origen de datos FIRMS.</w:t>
+        <w:t xml:space="preserve"> - Validación con origen de datos FIRMS.</w:t>
       </w:r>
     </w:p>
     <w:p/>
@@ -11921,9 +11883,8 @@
         <w:rPr>
           <w:noProof/>
         </w:rPr>
-        <w:lastRenderedPageBreak/>
         <w:drawing>
-          <wp:inline distT="0" distB="0" distL="0" distR="0" wp14:anchorId="1B628224" wp14:editId="38BF9E53">
+          <wp:inline distT="0" distB="0" distL="0" distR="0" wp14:anchorId="1B628224" wp14:editId="43BDF691">
             <wp:extent cx="5400040" cy="2138045"/>
             <wp:effectExtent l="0" t="0" r="0" b="0"/>
             <wp:docPr id="91008185" name="Imagen 1" descr="Gráfico, Calendario&#10;&#10;El contenido generado por IA puede ser incorrecto."/>
@@ -12033,6 +11994,1179 @@
         <w:t xml:space="preserve"> - Mapeo de coordenadas y frecuencia de observaciones.</w:t>
       </w:r>
     </w:p>
+    <w:p/>
+    <w:p>
+      <w:pPr>
+        <w:ind w:firstLine="0"/>
+        <w:jc w:val="both"/>
+      </w:pPr>
+      <w:r>
+        <w:tab/>
+        <w:t xml:space="preserve">Una vez constatada la coherencia geográfica con el área y el rango </w:t>
+      </w:r>
+      <w:r>
+        <w:t>de fechas</w:t>
+      </w:r>
+      <w:r>
+        <w:t xml:space="preserve"> de estudio, se procedió</w:t>
+      </w:r>
+      <w:r>
+        <w:t xml:space="preserve"> a generar código para analizar los datos meteorológicos y relacionados a FWI:</w:t>
+      </w:r>
+    </w:p>
+    <w:p>
+      <w:pPr>
+        <w:keepNext/>
+        <w:ind w:firstLine="0"/>
+        <w:jc w:val="both"/>
+      </w:pPr>
+      <w:r>
+        <w:rPr>
+          <w:noProof/>
+        </w:rPr>
+        <w:drawing>
+          <wp:inline distT="0" distB="0" distL="0" distR="0" wp14:anchorId="3F7B9F5D" wp14:editId="7442B36C">
+            <wp:extent cx="5400040" cy="2371090"/>
+            <wp:effectExtent l="0" t="0" r="0" b="0"/>
+            <wp:docPr id="952415538" name="Imagen 1"/>
+            <wp:cNvGraphicFramePr>
+              <a:graphicFrameLocks xmlns:a="http://schemas.openxmlformats.org/drawingml/2006/main" noChangeAspect="1"/>
+            </wp:cNvGraphicFramePr>
+            <a:graphic xmlns:a="http://schemas.openxmlformats.org/drawingml/2006/main">
+              <a:graphicData uri="http://schemas.openxmlformats.org/drawingml/2006/picture">
+                <pic:pic xmlns:pic="http://schemas.openxmlformats.org/drawingml/2006/picture">
+                  <pic:nvPicPr>
+                    <pic:cNvPr id="952415538" name="Imagen 952415538"/>
+                    <pic:cNvPicPr/>
+                  </pic:nvPicPr>
+                  <pic:blipFill>
+                    <a:blip r:embed="rId12" cstate="print">
+                      <a:extLst>
+                        <a:ext uri="{28A0092B-C50C-407E-A947-70E740481C1C}">
+                          <a14:useLocalDpi xmlns:a14="http://schemas.microsoft.com/office/drawing/2010/main" val="0"/>
+                        </a:ext>
+                      </a:extLst>
+                    </a:blip>
+                    <a:stretch>
+                      <a:fillRect/>
+                    </a:stretch>
+                  </pic:blipFill>
+                  <pic:spPr>
+                    <a:xfrm>
+                      <a:off x="0" y="0"/>
+                      <a:ext cx="5400040" cy="2371090"/>
+                    </a:xfrm>
+                    <a:prstGeom prst="rect">
+                      <a:avLst/>
+                    </a:prstGeom>
+                  </pic:spPr>
+                </pic:pic>
+              </a:graphicData>
+            </a:graphic>
+          </wp:inline>
+        </w:drawing>
+      </w:r>
+    </w:p>
+    <w:p>
+      <w:pPr>
+        <w:pStyle w:val="Descripcin"/>
+        <w:jc w:val="center"/>
+        <w:rPr>
+          <w:b/>
+          <w:bCs/>
+          <w:color w:val="auto"/>
+        </w:rPr>
+      </w:pPr>
+      <w:r>
+        <w:rPr>
+          <w:b/>
+          <w:bCs/>
+          <w:color w:val="auto"/>
+        </w:rPr>
+        <w:t xml:space="preserve">Imagen </w:t>
+      </w:r>
+      <w:r>
+        <w:rPr>
+          <w:b/>
+          <w:bCs/>
+          <w:color w:val="auto"/>
+        </w:rPr>
+        <w:fldChar w:fldCharType="begin"/>
+      </w:r>
+      <w:r>
+        <w:rPr>
+          <w:b/>
+          <w:bCs/>
+          <w:color w:val="auto"/>
+        </w:rPr>
+        <w:instrText xml:space="preserve"> SEQ Imagen \* ARABIC </w:instrText>
+      </w:r>
+      <w:r>
+        <w:rPr>
+          <w:b/>
+          <w:bCs/>
+          <w:color w:val="auto"/>
+        </w:rPr>
+        <w:fldChar w:fldCharType="separate"/>
+      </w:r>
+      <w:r>
+        <w:rPr>
+          <w:b/>
+          <w:bCs/>
+          <w:noProof/>
+          <w:color w:val="auto"/>
+        </w:rPr>
+        <w:t>3</w:t>
+      </w:r>
+      <w:r>
+        <w:rPr>
+          <w:b/>
+          <w:bCs/>
+          <w:color w:val="auto"/>
+        </w:rPr>
+        <w:fldChar w:fldCharType="end"/>
+      </w:r>
+      <w:r>
+        <w:rPr>
+          <w:b/>
+          <w:bCs/>
+          <w:color w:val="auto"/>
+        </w:rPr>
+        <w:t xml:space="preserve"> - Análisis temporal de FWI en -41.5, -71.8.</w:t>
+      </w:r>
+    </w:p>
+    <w:p>
+      <w:pPr>
+        <w:jc w:val="both"/>
+      </w:pPr>
+      <w:r>
+        <w:t>Los gráficos mostrados son generados a partir de un solo par de coordenadas, de otra forma quedaría inconsistente. En el análisis temporal se puede evidenciar la coherencia de las variables derivadas del FWI en relación con las meteorológicas, por ejemplo, como el efecto de las precipitaciones llevan el índice a prácticamente cero y la influencia de la velocidad del viento. También se observa la gran precipitación del día 23 de febrero de 2025 que fue la principal causa de la desaparición de los focos de calor.</w:t>
+      </w:r>
+    </w:p>
+    <w:p>
+      <w:pPr>
+        <w:jc w:val="both"/>
+      </w:pPr>
+    </w:p>
+    <w:p>
+      <w:pPr>
+        <w:keepNext/>
+        <w:ind w:firstLine="0"/>
+        <w:jc w:val="center"/>
+      </w:pPr>
+      <w:r>
+        <w:rPr>
+          <w:noProof/>
+        </w:rPr>
+        <w:lastRenderedPageBreak/>
+        <w:drawing>
+          <wp:inline distT="0" distB="0" distL="0" distR="0" wp14:anchorId="3C7A16B2" wp14:editId="4FB73D78">
+            <wp:extent cx="5278581" cy="1303507"/>
+            <wp:effectExtent l="0" t="0" r="0" b="0"/>
+            <wp:docPr id="1153105388" name="Imagen 2"/>
+            <wp:cNvGraphicFramePr>
+              <a:graphicFrameLocks xmlns:a="http://schemas.openxmlformats.org/drawingml/2006/main" noChangeAspect="1"/>
+            </wp:cNvGraphicFramePr>
+            <a:graphic xmlns:a="http://schemas.openxmlformats.org/drawingml/2006/main">
+              <a:graphicData uri="http://schemas.openxmlformats.org/drawingml/2006/picture">
+                <pic:pic xmlns:pic="http://schemas.openxmlformats.org/drawingml/2006/picture">
+                  <pic:nvPicPr>
+                    <pic:cNvPr id="1153105388" name="Imagen 1153105388"/>
+                    <pic:cNvPicPr/>
+                  </pic:nvPicPr>
+                  <pic:blipFill>
+                    <a:blip r:embed="rId13" cstate="print">
+                      <a:extLst>
+                        <a:ext uri="{28A0092B-C50C-407E-A947-70E740481C1C}">
+                          <a14:useLocalDpi xmlns:a14="http://schemas.microsoft.com/office/drawing/2010/main" val="0"/>
+                        </a:ext>
+                      </a:extLst>
+                    </a:blip>
+                    <a:stretch>
+                      <a:fillRect/>
+                    </a:stretch>
+                  </pic:blipFill>
+                  <pic:spPr>
+                    <a:xfrm>
+                      <a:off x="0" y="0"/>
+                      <a:ext cx="5317799" cy="1313192"/>
+                    </a:xfrm>
+                    <a:prstGeom prst="rect">
+                      <a:avLst/>
+                    </a:prstGeom>
+                  </pic:spPr>
+                </pic:pic>
+              </a:graphicData>
+            </a:graphic>
+          </wp:inline>
+        </w:drawing>
+      </w:r>
+    </w:p>
+    <w:p>
+      <w:pPr>
+        <w:pStyle w:val="Descripcin"/>
+        <w:ind w:firstLine="0"/>
+        <w:jc w:val="center"/>
+        <w:rPr>
+          <w:b/>
+          <w:bCs/>
+          <w:color w:val="auto"/>
+        </w:rPr>
+      </w:pPr>
+      <w:r>
+        <w:rPr>
+          <w:b/>
+          <w:bCs/>
+          <w:color w:val="auto"/>
+        </w:rPr>
+        <w:t xml:space="preserve">Imagen </w:t>
+      </w:r>
+      <w:r>
+        <w:rPr>
+          <w:b/>
+          <w:bCs/>
+          <w:color w:val="auto"/>
+        </w:rPr>
+        <w:fldChar w:fldCharType="begin"/>
+      </w:r>
+      <w:r>
+        <w:rPr>
+          <w:b/>
+          <w:bCs/>
+          <w:color w:val="auto"/>
+        </w:rPr>
+        <w:instrText xml:space="preserve"> SEQ Imagen \* ARABIC </w:instrText>
+      </w:r>
+      <w:r>
+        <w:rPr>
+          <w:b/>
+          <w:bCs/>
+          <w:color w:val="auto"/>
+        </w:rPr>
+        <w:fldChar w:fldCharType="separate"/>
+      </w:r>
+      <w:r>
+        <w:rPr>
+          <w:b/>
+          <w:bCs/>
+          <w:noProof/>
+          <w:color w:val="auto"/>
+        </w:rPr>
+        <w:t>4</w:t>
+      </w:r>
+      <w:r>
+        <w:rPr>
+          <w:b/>
+          <w:bCs/>
+          <w:color w:val="auto"/>
+        </w:rPr>
+        <w:fldChar w:fldCharType="end"/>
+      </w:r>
+      <w:r>
+        <w:rPr>
+          <w:b/>
+          <w:bCs/>
+          <w:color w:val="auto"/>
+        </w:rPr>
+        <w:t xml:space="preserve"> - Matriz de correlación de variables meteorológicas y FWI.</w:t>
+      </w:r>
+    </w:p>
+    <w:p>
+      <w:pPr>
+        <w:keepNext/>
+        <w:ind w:firstLine="0"/>
+        <w:jc w:val="center"/>
+      </w:pPr>
+      <w:r>
+        <w:rPr>
+          <w:noProof/>
+        </w:rPr>
+        <w:drawing>
+          <wp:inline distT="0" distB="0" distL="0" distR="0" wp14:anchorId="59AC7870" wp14:editId="4F3C19D1">
+            <wp:extent cx="5400040" cy="1452880"/>
+            <wp:effectExtent l="0" t="0" r="0" b="0"/>
+            <wp:docPr id="724237226" name="Imagen 3"/>
+            <wp:cNvGraphicFramePr>
+              <a:graphicFrameLocks xmlns:a="http://schemas.openxmlformats.org/drawingml/2006/main" noChangeAspect="1"/>
+            </wp:cNvGraphicFramePr>
+            <a:graphic xmlns:a="http://schemas.openxmlformats.org/drawingml/2006/main">
+              <a:graphicData uri="http://schemas.openxmlformats.org/drawingml/2006/picture">
+                <pic:pic xmlns:pic="http://schemas.openxmlformats.org/drawingml/2006/picture">
+                  <pic:nvPicPr>
+                    <pic:cNvPr id="724237226" name="Imagen 724237226"/>
+                    <pic:cNvPicPr/>
+                  </pic:nvPicPr>
+                  <pic:blipFill>
+                    <a:blip r:embed="rId14" cstate="print">
+                      <a:extLst>
+                        <a:ext uri="{28A0092B-C50C-407E-A947-70E740481C1C}">
+                          <a14:useLocalDpi xmlns:a14="http://schemas.microsoft.com/office/drawing/2010/main" val="0"/>
+                        </a:ext>
+                      </a:extLst>
+                    </a:blip>
+                    <a:stretch>
+                      <a:fillRect/>
+                    </a:stretch>
+                  </pic:blipFill>
+                  <pic:spPr>
+                    <a:xfrm>
+                      <a:off x="0" y="0"/>
+                      <a:ext cx="5400040" cy="1452880"/>
+                    </a:xfrm>
+                    <a:prstGeom prst="rect">
+                      <a:avLst/>
+                    </a:prstGeom>
+                  </pic:spPr>
+                </pic:pic>
+              </a:graphicData>
+            </a:graphic>
+          </wp:inline>
+        </w:drawing>
+      </w:r>
+    </w:p>
+    <w:p>
+      <w:pPr>
+        <w:pStyle w:val="Descripcin"/>
+        <w:jc w:val="center"/>
+        <w:rPr>
+          <w:b/>
+          <w:bCs/>
+          <w:color w:val="auto"/>
+        </w:rPr>
+      </w:pPr>
+      <w:r>
+        <w:rPr>
+          <w:b/>
+          <w:bCs/>
+          <w:color w:val="auto"/>
+        </w:rPr>
+        <w:t xml:space="preserve">Imagen </w:t>
+      </w:r>
+      <w:r>
+        <w:rPr>
+          <w:b/>
+          <w:bCs/>
+          <w:color w:val="auto"/>
+        </w:rPr>
+        <w:fldChar w:fldCharType="begin"/>
+      </w:r>
+      <w:r>
+        <w:rPr>
+          <w:b/>
+          <w:bCs/>
+          <w:color w:val="auto"/>
+        </w:rPr>
+        <w:instrText xml:space="preserve"> SEQ Imagen \* ARABIC </w:instrText>
+      </w:r>
+      <w:r>
+        <w:rPr>
+          <w:b/>
+          <w:bCs/>
+          <w:color w:val="auto"/>
+        </w:rPr>
+        <w:fldChar w:fldCharType="separate"/>
+      </w:r>
+      <w:r>
+        <w:rPr>
+          <w:b/>
+          <w:bCs/>
+          <w:noProof/>
+          <w:color w:val="auto"/>
+        </w:rPr>
+        <w:t>5</w:t>
+      </w:r>
+      <w:r>
+        <w:rPr>
+          <w:b/>
+          <w:bCs/>
+          <w:color w:val="auto"/>
+        </w:rPr>
+        <w:fldChar w:fldCharType="end"/>
+      </w:r>
+      <w:r>
+        <w:rPr>
+          <w:b/>
+          <w:bCs/>
+          <w:color w:val="auto"/>
+        </w:rPr>
+        <w:t xml:space="preserve"> - Distribución de categorías de riesgo según FWI.</w:t>
+      </w:r>
+    </w:p>
+    <w:p/>
+    <w:tbl>
+      <w:tblPr>
+        <w:tblStyle w:val="Tablaconcuadrcula"/>
+        <w:tblW w:w="0" w:type="auto"/>
+        <w:jc w:val="center"/>
+        <w:tblLook w:val="04A0" w:firstRow="1" w:lastRow="0" w:firstColumn="1" w:lastColumn="0" w:noHBand="0" w:noVBand="1"/>
+      </w:tblPr>
+      <w:tblGrid>
+        <w:gridCol w:w="2766"/>
+        <w:gridCol w:w="2066"/>
+      </w:tblGrid>
+      <w:tr>
+        <w:trPr>
+          <w:trHeight w:val="300"/>
+          <w:jc w:val="center"/>
+        </w:trPr>
+        <w:tc>
+          <w:tcPr>
+            <w:tcW w:w="0" w:type="auto"/>
+            <w:noWrap/>
+            <w:vAlign w:val="center"/>
+            <w:hideMark/>
+          </w:tcPr>
+          <w:p>
+            <w:pPr>
+              <w:ind w:firstLine="0"/>
+              <w:jc w:val="center"/>
+              <w:rPr>
+                <w:rFonts w:eastAsia="Times New Roman" w:cs="Times New Roman"/>
+                <w:b/>
+                <w:bCs/>
+                <w:i/>
+                <w:iCs/>
+                <w:color w:val="000000"/>
+                <w:kern w:val="0"/>
+                <w:sz w:val="18"/>
+                <w:szCs w:val="18"/>
+                <w:lang w:eastAsia="es-AR"/>
+                <w14:ligatures w14:val="none"/>
+              </w:rPr>
+            </w:pPr>
+            <w:r>
+              <w:rPr>
+                <w:rFonts w:eastAsia="Times New Roman" w:cs="Times New Roman"/>
+                <w:b/>
+                <w:bCs/>
+                <w:i/>
+                <w:iCs/>
+                <w:color w:val="000000"/>
+                <w:kern w:val="0"/>
+                <w:sz w:val="18"/>
+                <w:szCs w:val="18"/>
+                <w:lang w:eastAsia="es-AR"/>
+                <w14:ligatures w14:val="none"/>
+              </w:rPr>
+              <w:t>Métrica</w:t>
+            </w:r>
+          </w:p>
+        </w:tc>
+        <w:tc>
+          <w:tcPr>
+            <w:tcW w:w="0" w:type="auto"/>
+            <w:noWrap/>
+            <w:vAlign w:val="center"/>
+            <w:hideMark/>
+          </w:tcPr>
+          <w:p>
+            <w:pPr>
+              <w:ind w:firstLine="0"/>
+              <w:jc w:val="center"/>
+              <w:rPr>
+                <w:rFonts w:eastAsia="Times New Roman" w:cs="Times New Roman"/>
+                <w:b/>
+                <w:bCs/>
+                <w:i/>
+                <w:iCs/>
+                <w:color w:val="000000"/>
+                <w:kern w:val="0"/>
+                <w:sz w:val="18"/>
+                <w:szCs w:val="18"/>
+                <w:lang w:eastAsia="es-AR"/>
+                <w14:ligatures w14:val="none"/>
+              </w:rPr>
+            </w:pPr>
+            <w:r>
+              <w:rPr>
+                <w:rFonts w:eastAsia="Times New Roman" w:cs="Times New Roman"/>
+                <w:b/>
+                <w:bCs/>
+                <w:i/>
+                <w:iCs/>
+                <w:color w:val="000000"/>
+                <w:kern w:val="0"/>
+                <w:sz w:val="18"/>
+                <w:szCs w:val="18"/>
+                <w:lang w:eastAsia="es-AR"/>
+                <w14:ligatures w14:val="none"/>
+              </w:rPr>
+              <w:t>Valor</w:t>
+            </w:r>
+          </w:p>
+        </w:tc>
+      </w:tr>
+      <w:tr>
+        <w:trPr>
+          <w:trHeight w:val="300"/>
+          <w:jc w:val="center"/>
+        </w:trPr>
+        <w:tc>
+          <w:tcPr>
+            <w:tcW w:w="0" w:type="auto"/>
+            <w:noWrap/>
+            <w:vAlign w:val="center"/>
+            <w:hideMark/>
+          </w:tcPr>
+          <w:p>
+            <w:pPr>
+              <w:ind w:firstLine="0"/>
+              <w:rPr>
+                <w:rFonts w:eastAsia="Times New Roman" w:cs="Times New Roman"/>
+                <w:color w:val="000000"/>
+                <w:kern w:val="0"/>
+                <w:sz w:val="18"/>
+                <w:szCs w:val="18"/>
+                <w:lang w:eastAsia="es-AR"/>
+                <w14:ligatures w14:val="none"/>
+              </w:rPr>
+            </w:pPr>
+            <w:r>
+              <w:rPr>
+                <w:rFonts w:eastAsia="Times New Roman" w:cs="Times New Roman"/>
+                <w:color w:val="000000"/>
+                <w:kern w:val="0"/>
+                <w:sz w:val="18"/>
+                <w:szCs w:val="18"/>
+                <w:lang w:eastAsia="es-AR"/>
+                <w14:ligatures w14:val="none"/>
+              </w:rPr>
+              <w:t>Período de Análisis</w:t>
+            </w:r>
+          </w:p>
+        </w:tc>
+        <w:tc>
+          <w:tcPr>
+            <w:tcW w:w="0" w:type="auto"/>
+            <w:noWrap/>
+            <w:vAlign w:val="center"/>
+            <w:hideMark/>
+          </w:tcPr>
+          <w:p>
+            <w:pPr>
+              <w:ind w:firstLine="0"/>
+              <w:jc w:val="right"/>
+              <w:rPr>
+                <w:rFonts w:eastAsia="Times New Roman" w:cs="Times New Roman"/>
+                <w:color w:val="000000"/>
+                <w:kern w:val="0"/>
+                <w:sz w:val="18"/>
+                <w:szCs w:val="18"/>
+                <w:lang w:eastAsia="es-AR"/>
+                <w14:ligatures w14:val="none"/>
+              </w:rPr>
+            </w:pPr>
+            <w:r>
+              <w:rPr>
+                <w:rFonts w:eastAsia="Times New Roman" w:cs="Times New Roman"/>
+                <w:color w:val="000000"/>
+                <w:kern w:val="0"/>
+                <w:sz w:val="18"/>
+                <w:szCs w:val="18"/>
+                <w:lang w:eastAsia="es-AR"/>
+                <w14:ligatures w14:val="none"/>
+              </w:rPr>
+              <w:t>2024-12-01 a 2025-03-28</w:t>
+            </w:r>
+          </w:p>
+        </w:tc>
+      </w:tr>
+      <w:tr>
+        <w:trPr>
+          <w:trHeight w:val="300"/>
+          <w:jc w:val="center"/>
+        </w:trPr>
+        <w:tc>
+          <w:tcPr>
+            <w:tcW w:w="0" w:type="auto"/>
+            <w:noWrap/>
+            <w:vAlign w:val="center"/>
+            <w:hideMark/>
+          </w:tcPr>
+          <w:p>
+            <w:pPr>
+              <w:ind w:firstLine="0"/>
+              <w:rPr>
+                <w:rFonts w:eastAsia="Times New Roman" w:cs="Times New Roman"/>
+                <w:color w:val="000000"/>
+                <w:kern w:val="0"/>
+                <w:sz w:val="18"/>
+                <w:szCs w:val="18"/>
+                <w:lang w:eastAsia="es-AR"/>
+                <w14:ligatures w14:val="none"/>
+              </w:rPr>
+            </w:pPr>
+            <w:r>
+              <w:rPr>
+                <w:rFonts w:eastAsia="Times New Roman" w:cs="Times New Roman"/>
+                <w:color w:val="000000"/>
+                <w:kern w:val="0"/>
+                <w:sz w:val="18"/>
+                <w:szCs w:val="18"/>
+                <w:lang w:eastAsia="es-AR"/>
+                <w14:ligatures w14:val="none"/>
+              </w:rPr>
+              <w:t>Puntos Geográficos</w:t>
+            </w:r>
+          </w:p>
+        </w:tc>
+        <w:tc>
+          <w:tcPr>
+            <w:tcW w:w="0" w:type="auto"/>
+            <w:noWrap/>
+            <w:vAlign w:val="center"/>
+            <w:hideMark/>
+          </w:tcPr>
+          <w:p>
+            <w:pPr>
+              <w:ind w:firstLine="0"/>
+              <w:jc w:val="right"/>
+              <w:rPr>
+                <w:rFonts w:eastAsia="Times New Roman" w:cs="Times New Roman"/>
+                <w:color w:val="000000"/>
+                <w:kern w:val="0"/>
+                <w:sz w:val="18"/>
+                <w:szCs w:val="18"/>
+                <w:lang w:eastAsia="es-AR"/>
+                <w14:ligatures w14:val="none"/>
+              </w:rPr>
+            </w:pPr>
+            <w:r>
+              <w:rPr>
+                <w:rFonts w:eastAsia="Times New Roman" w:cs="Times New Roman"/>
+                <w:color w:val="000000"/>
+                <w:kern w:val="0"/>
+                <w:sz w:val="18"/>
+                <w:szCs w:val="18"/>
+                <w:lang w:eastAsia="es-AR"/>
+                <w14:ligatures w14:val="none"/>
+              </w:rPr>
+              <w:t>121</w:t>
+            </w:r>
+          </w:p>
+        </w:tc>
+      </w:tr>
+      <w:tr>
+        <w:trPr>
+          <w:trHeight w:val="300"/>
+          <w:jc w:val="center"/>
+        </w:trPr>
+        <w:tc>
+          <w:tcPr>
+            <w:tcW w:w="0" w:type="auto"/>
+            <w:noWrap/>
+            <w:vAlign w:val="center"/>
+            <w:hideMark/>
+          </w:tcPr>
+          <w:p>
+            <w:pPr>
+              <w:ind w:firstLine="0"/>
+              <w:rPr>
+                <w:rFonts w:eastAsia="Times New Roman" w:cs="Times New Roman"/>
+                <w:color w:val="000000"/>
+                <w:kern w:val="0"/>
+                <w:sz w:val="18"/>
+                <w:szCs w:val="18"/>
+                <w:lang w:eastAsia="es-AR"/>
+                <w14:ligatures w14:val="none"/>
+              </w:rPr>
+            </w:pPr>
+            <w:r>
+              <w:rPr>
+                <w:rFonts w:eastAsia="Times New Roman" w:cs="Times New Roman"/>
+                <w:color w:val="000000"/>
+                <w:kern w:val="0"/>
+                <w:sz w:val="18"/>
+                <w:szCs w:val="18"/>
+                <w:lang w:eastAsia="es-AR"/>
+                <w14:ligatures w14:val="none"/>
+              </w:rPr>
+              <w:t>Días con Incendios</w:t>
+            </w:r>
+          </w:p>
+        </w:tc>
+        <w:tc>
+          <w:tcPr>
+            <w:tcW w:w="0" w:type="auto"/>
+            <w:noWrap/>
+            <w:vAlign w:val="center"/>
+            <w:hideMark/>
+          </w:tcPr>
+          <w:p>
+            <w:pPr>
+              <w:ind w:firstLine="0"/>
+              <w:jc w:val="right"/>
+              <w:rPr>
+                <w:rFonts w:eastAsia="Times New Roman" w:cs="Times New Roman"/>
+                <w:color w:val="000000"/>
+                <w:kern w:val="0"/>
+                <w:sz w:val="18"/>
+                <w:szCs w:val="18"/>
+                <w:lang w:eastAsia="es-AR"/>
+                <w14:ligatures w14:val="none"/>
+              </w:rPr>
+            </w:pPr>
+            <w:r>
+              <w:rPr>
+                <w:rFonts w:eastAsia="Times New Roman" w:cs="Times New Roman"/>
+                <w:color w:val="000000"/>
+                <w:kern w:val="0"/>
+                <w:sz w:val="18"/>
+                <w:szCs w:val="18"/>
+                <w:lang w:eastAsia="es-AR"/>
+                <w14:ligatures w14:val="none"/>
+              </w:rPr>
+              <w:t>21 (1.6% del período)</w:t>
+            </w:r>
+          </w:p>
+        </w:tc>
+      </w:tr>
+      <w:tr>
+        <w:trPr>
+          <w:trHeight w:val="300"/>
+          <w:jc w:val="center"/>
+        </w:trPr>
+        <w:tc>
+          <w:tcPr>
+            <w:tcW w:w="0" w:type="auto"/>
+            <w:noWrap/>
+            <w:vAlign w:val="center"/>
+            <w:hideMark/>
+          </w:tcPr>
+          <w:p>
+            <w:pPr>
+              <w:ind w:firstLine="0"/>
+              <w:rPr>
+                <w:rFonts w:eastAsia="Times New Roman" w:cs="Times New Roman"/>
+                <w:color w:val="000000"/>
+                <w:kern w:val="0"/>
+                <w:sz w:val="18"/>
+                <w:szCs w:val="18"/>
+                <w:lang w:eastAsia="es-AR"/>
+                <w14:ligatures w14:val="none"/>
+              </w:rPr>
+            </w:pPr>
+            <w:r>
+              <w:rPr>
+                <w:rFonts w:eastAsia="Times New Roman" w:cs="Times New Roman"/>
+                <w:color w:val="000000"/>
+                <w:kern w:val="0"/>
+                <w:sz w:val="18"/>
+                <w:szCs w:val="18"/>
+                <w:lang w:eastAsia="es-AR"/>
+                <w14:ligatures w14:val="none"/>
+              </w:rPr>
+              <w:t>Rango</w:t>
+            </w:r>
+          </w:p>
+        </w:tc>
+        <w:tc>
+          <w:tcPr>
+            <w:tcW w:w="0" w:type="auto"/>
+            <w:noWrap/>
+            <w:vAlign w:val="center"/>
+            <w:hideMark/>
+          </w:tcPr>
+          <w:p>
+            <w:pPr>
+              <w:ind w:firstLine="0"/>
+              <w:jc w:val="right"/>
+              <w:rPr>
+                <w:rFonts w:eastAsia="Times New Roman" w:cs="Times New Roman"/>
+                <w:color w:val="000000"/>
+                <w:kern w:val="0"/>
+                <w:sz w:val="18"/>
+                <w:szCs w:val="18"/>
+                <w:lang w:eastAsia="es-AR"/>
+                <w14:ligatures w14:val="none"/>
+              </w:rPr>
+            </w:pPr>
+            <w:r>
+              <w:rPr>
+                <w:rFonts w:eastAsia="Times New Roman" w:cs="Times New Roman"/>
+                <w:color w:val="000000"/>
+                <w:kern w:val="0"/>
+                <w:sz w:val="18"/>
+                <w:szCs w:val="18"/>
+                <w:lang w:eastAsia="es-AR"/>
+                <w14:ligatures w14:val="none"/>
+              </w:rPr>
+              <w:t>0.00 - 54.51</w:t>
+            </w:r>
+          </w:p>
+        </w:tc>
+      </w:tr>
+      <w:tr>
+        <w:trPr>
+          <w:trHeight w:val="300"/>
+          <w:jc w:val="center"/>
+        </w:trPr>
+        <w:tc>
+          <w:tcPr>
+            <w:tcW w:w="0" w:type="auto"/>
+            <w:noWrap/>
+            <w:vAlign w:val="center"/>
+            <w:hideMark/>
+          </w:tcPr>
+          <w:p>
+            <w:pPr>
+              <w:ind w:firstLine="0"/>
+              <w:rPr>
+                <w:rFonts w:eastAsia="Times New Roman" w:cs="Times New Roman"/>
+                <w:color w:val="000000"/>
+                <w:kern w:val="0"/>
+                <w:sz w:val="18"/>
+                <w:szCs w:val="18"/>
+                <w:lang w:eastAsia="es-AR"/>
+                <w14:ligatures w14:val="none"/>
+              </w:rPr>
+            </w:pPr>
+            <w:r>
+              <w:rPr>
+                <w:rFonts w:eastAsia="Times New Roman" w:cs="Times New Roman"/>
+                <w:color w:val="000000"/>
+                <w:kern w:val="0"/>
+                <w:sz w:val="18"/>
+                <w:szCs w:val="18"/>
+                <w:lang w:eastAsia="es-AR"/>
+                <w14:ligatures w14:val="none"/>
+              </w:rPr>
+              <w:t>Promedio</w:t>
+            </w:r>
+          </w:p>
+        </w:tc>
+        <w:tc>
+          <w:tcPr>
+            <w:tcW w:w="0" w:type="auto"/>
+            <w:noWrap/>
+            <w:vAlign w:val="center"/>
+            <w:hideMark/>
+          </w:tcPr>
+          <w:p>
+            <w:pPr>
+              <w:ind w:firstLine="0"/>
+              <w:jc w:val="right"/>
+              <w:rPr>
+                <w:rFonts w:eastAsia="Times New Roman" w:cs="Times New Roman"/>
+                <w:color w:val="000000"/>
+                <w:kern w:val="0"/>
+                <w:sz w:val="18"/>
+                <w:szCs w:val="18"/>
+                <w:lang w:eastAsia="es-AR"/>
+                <w14:ligatures w14:val="none"/>
+              </w:rPr>
+            </w:pPr>
+            <w:r>
+              <w:rPr>
+                <w:rFonts w:eastAsia="Times New Roman" w:cs="Times New Roman"/>
+                <w:color w:val="000000"/>
+                <w:kern w:val="0"/>
+                <w:sz w:val="18"/>
+                <w:szCs w:val="18"/>
+                <w:lang w:eastAsia="es-AR"/>
+                <w14:ligatures w14:val="none"/>
+              </w:rPr>
+              <w:t>9.07</w:t>
+            </w:r>
+          </w:p>
+        </w:tc>
+      </w:tr>
+      <w:tr>
+        <w:trPr>
+          <w:trHeight w:val="300"/>
+          <w:jc w:val="center"/>
+        </w:trPr>
+        <w:tc>
+          <w:tcPr>
+            <w:tcW w:w="0" w:type="auto"/>
+            <w:noWrap/>
+            <w:vAlign w:val="center"/>
+            <w:hideMark/>
+          </w:tcPr>
+          <w:p>
+            <w:pPr>
+              <w:ind w:firstLine="0"/>
+              <w:rPr>
+                <w:rFonts w:eastAsia="Times New Roman" w:cs="Times New Roman"/>
+                <w:color w:val="000000"/>
+                <w:kern w:val="0"/>
+                <w:sz w:val="18"/>
+                <w:szCs w:val="18"/>
+                <w:lang w:eastAsia="es-AR"/>
+                <w14:ligatures w14:val="none"/>
+              </w:rPr>
+            </w:pPr>
+            <w:r>
+              <w:rPr>
+                <w:rFonts w:eastAsia="Times New Roman" w:cs="Times New Roman"/>
+                <w:color w:val="000000"/>
+                <w:kern w:val="0"/>
+                <w:sz w:val="18"/>
+                <w:szCs w:val="18"/>
+                <w:lang w:eastAsia="es-AR"/>
+                <w14:ligatures w14:val="none"/>
+              </w:rPr>
+              <w:t>Máximo Registrado</w:t>
+            </w:r>
+          </w:p>
+        </w:tc>
+        <w:tc>
+          <w:tcPr>
+            <w:tcW w:w="0" w:type="auto"/>
+            <w:noWrap/>
+            <w:vAlign w:val="center"/>
+            <w:hideMark/>
+          </w:tcPr>
+          <w:p>
+            <w:pPr>
+              <w:ind w:firstLine="0"/>
+              <w:jc w:val="right"/>
+              <w:rPr>
+                <w:rFonts w:eastAsia="Times New Roman" w:cs="Times New Roman"/>
+                <w:color w:val="000000"/>
+                <w:kern w:val="0"/>
+                <w:sz w:val="18"/>
+                <w:szCs w:val="18"/>
+                <w:lang w:eastAsia="es-AR"/>
+                <w14:ligatures w14:val="none"/>
+              </w:rPr>
+            </w:pPr>
+            <w:r>
+              <w:rPr>
+                <w:rFonts w:eastAsia="Times New Roman" w:cs="Times New Roman"/>
+                <w:color w:val="000000"/>
+                <w:kern w:val="0"/>
+                <w:sz w:val="18"/>
+                <w:szCs w:val="18"/>
+                <w:lang w:eastAsia="es-AR"/>
+                <w14:ligatures w14:val="none"/>
+              </w:rPr>
+              <w:t>54.51</w:t>
+            </w:r>
+          </w:p>
+        </w:tc>
+      </w:tr>
+      <w:tr>
+        <w:trPr>
+          <w:trHeight w:val="300"/>
+          <w:jc w:val="center"/>
+        </w:trPr>
+        <w:tc>
+          <w:tcPr>
+            <w:tcW w:w="0" w:type="auto"/>
+            <w:noWrap/>
+            <w:vAlign w:val="center"/>
+            <w:hideMark/>
+          </w:tcPr>
+          <w:p>
+            <w:pPr>
+              <w:ind w:firstLine="0"/>
+              <w:rPr>
+                <w:rFonts w:eastAsia="Times New Roman" w:cs="Times New Roman"/>
+                <w:color w:val="000000"/>
+                <w:kern w:val="0"/>
+                <w:sz w:val="18"/>
+                <w:szCs w:val="18"/>
+                <w:lang w:eastAsia="es-AR"/>
+                <w14:ligatures w14:val="none"/>
+              </w:rPr>
+            </w:pPr>
+            <w:r>
+              <w:rPr>
+                <w:rFonts w:eastAsia="Times New Roman" w:cs="Times New Roman"/>
+                <w:color w:val="000000"/>
+                <w:kern w:val="0"/>
+                <w:sz w:val="18"/>
+                <w:szCs w:val="18"/>
+                <w:lang w:eastAsia="es-AR"/>
+                <w14:ligatures w14:val="none"/>
+              </w:rPr>
+              <w:t>FWI Promedio (Días con Incendio)</w:t>
+            </w:r>
+          </w:p>
+        </w:tc>
+        <w:tc>
+          <w:tcPr>
+            <w:tcW w:w="0" w:type="auto"/>
+            <w:noWrap/>
+            <w:vAlign w:val="center"/>
+            <w:hideMark/>
+          </w:tcPr>
+          <w:p>
+            <w:pPr>
+              <w:ind w:firstLine="0"/>
+              <w:jc w:val="right"/>
+              <w:rPr>
+                <w:rFonts w:eastAsia="Times New Roman" w:cs="Times New Roman"/>
+                <w:color w:val="000000"/>
+                <w:kern w:val="0"/>
+                <w:sz w:val="18"/>
+                <w:szCs w:val="18"/>
+                <w:lang w:eastAsia="es-AR"/>
+                <w14:ligatures w14:val="none"/>
+              </w:rPr>
+            </w:pPr>
+            <w:r>
+              <w:rPr>
+                <w:rFonts w:eastAsia="Times New Roman" w:cs="Times New Roman"/>
+                <w:color w:val="000000"/>
+                <w:kern w:val="0"/>
+                <w:sz w:val="18"/>
+                <w:szCs w:val="18"/>
+                <w:lang w:eastAsia="es-AR"/>
+                <w14:ligatures w14:val="none"/>
+              </w:rPr>
+              <w:t>6.05</w:t>
+            </w:r>
+          </w:p>
+        </w:tc>
+      </w:tr>
+      <w:tr>
+        <w:trPr>
+          <w:trHeight w:val="300"/>
+          <w:jc w:val="center"/>
+        </w:trPr>
+        <w:tc>
+          <w:tcPr>
+            <w:tcW w:w="0" w:type="auto"/>
+            <w:noWrap/>
+            <w:vAlign w:val="center"/>
+            <w:hideMark/>
+          </w:tcPr>
+          <w:p>
+            <w:pPr>
+              <w:ind w:firstLine="0"/>
+              <w:rPr>
+                <w:rFonts w:eastAsia="Times New Roman" w:cs="Times New Roman"/>
+                <w:color w:val="000000"/>
+                <w:kern w:val="0"/>
+                <w:sz w:val="18"/>
+                <w:szCs w:val="18"/>
+                <w:lang w:eastAsia="es-AR"/>
+                <w14:ligatures w14:val="none"/>
+              </w:rPr>
+            </w:pPr>
+            <w:r>
+              <w:rPr>
+                <w:rFonts w:eastAsia="Times New Roman" w:cs="Times New Roman"/>
+                <w:color w:val="000000"/>
+                <w:kern w:val="0"/>
+                <w:sz w:val="18"/>
+                <w:szCs w:val="18"/>
+                <w:lang w:eastAsia="es-AR"/>
+                <w14:ligatures w14:val="none"/>
+              </w:rPr>
+              <w:t>FWI Promedio (Días sin Incendio)</w:t>
+            </w:r>
+          </w:p>
+        </w:tc>
+        <w:tc>
+          <w:tcPr>
+            <w:tcW w:w="0" w:type="auto"/>
+            <w:noWrap/>
+            <w:vAlign w:val="center"/>
+            <w:hideMark/>
+          </w:tcPr>
+          <w:p>
+            <w:pPr>
+              <w:keepNext/>
+              <w:ind w:firstLine="0"/>
+              <w:jc w:val="right"/>
+              <w:rPr>
+                <w:rFonts w:eastAsia="Times New Roman" w:cs="Times New Roman"/>
+                <w:color w:val="000000"/>
+                <w:kern w:val="0"/>
+                <w:sz w:val="18"/>
+                <w:szCs w:val="18"/>
+                <w:lang w:eastAsia="es-AR"/>
+                <w14:ligatures w14:val="none"/>
+              </w:rPr>
+            </w:pPr>
+            <w:r>
+              <w:rPr>
+                <w:rFonts w:eastAsia="Times New Roman" w:cs="Times New Roman"/>
+                <w:color w:val="000000"/>
+                <w:kern w:val="0"/>
+                <w:sz w:val="18"/>
+                <w:szCs w:val="18"/>
+                <w:lang w:eastAsia="es-AR"/>
+                <w14:ligatures w14:val="none"/>
+              </w:rPr>
+              <w:t>9.12</w:t>
+            </w:r>
+          </w:p>
+        </w:tc>
+      </w:tr>
+    </w:tbl>
+    <w:p>
+      <w:pPr>
+        <w:pStyle w:val="Descripcin"/>
+        <w:ind w:firstLine="0"/>
+        <w:jc w:val="center"/>
+        <w:rPr>
+          <w:b/>
+          <w:bCs/>
+          <w:color w:val="auto"/>
+        </w:rPr>
+      </w:pPr>
+      <w:r>
+        <w:rPr>
+          <w:b/>
+          <w:bCs/>
+          <w:color w:val="auto"/>
+        </w:rPr>
+        <w:t xml:space="preserve">Tabla </w:t>
+      </w:r>
+      <w:r>
+        <w:rPr>
+          <w:b/>
+          <w:bCs/>
+          <w:color w:val="auto"/>
+        </w:rPr>
+        <w:fldChar w:fldCharType="begin"/>
+      </w:r>
+      <w:r>
+        <w:rPr>
+          <w:b/>
+          <w:bCs/>
+          <w:color w:val="auto"/>
+        </w:rPr>
+        <w:instrText xml:space="preserve"> SEQ Tabla \* ARABIC </w:instrText>
+      </w:r>
+      <w:r>
+        <w:rPr>
+          <w:b/>
+          <w:bCs/>
+          <w:color w:val="auto"/>
+        </w:rPr>
+        <w:fldChar w:fldCharType="separate"/>
+      </w:r>
+      <w:r>
+        <w:rPr>
+          <w:b/>
+          <w:bCs/>
+          <w:noProof/>
+          <w:color w:val="auto"/>
+        </w:rPr>
+        <w:t>4</w:t>
+      </w:r>
+      <w:r>
+        <w:rPr>
+          <w:b/>
+          <w:bCs/>
+          <w:color w:val="auto"/>
+        </w:rPr>
+        <w:fldChar w:fldCharType="end"/>
+      </w:r>
+      <w:r>
+        <w:rPr>
+          <w:b/>
+          <w:bCs/>
+          <w:color w:val="auto"/>
+        </w:rPr>
+        <w:t xml:space="preserve"> - Resumen FWI para el periodo de estudio.</w:t>
+      </w:r>
+    </w:p>
     <w:p>
       <w:pPr>
         <w:pStyle w:val="Ttulo1"/>
@@ -12132,6 +13266,7 @@
           <w:rFonts w:ascii="Times New Roman" w:hAnsi="Times New Roman" w:cs="Times New Roman"/>
           <w:color w:val="000000" w:themeColor="text1"/>
         </w:rPr>
+        <w:lastRenderedPageBreak/>
         <w:t>Apéndices</w:t>
       </w:r>
       <w:bookmarkEnd w:id="14"/>
@@ -12229,7 +13364,6 @@
         <w:rPr>
           <w:noProof/>
         </w:rPr>
-        <w:lastRenderedPageBreak/>
         <w:drawing>
           <wp:inline distT="0" distB="0" distL="0" distR="0" wp14:anchorId="5B09DC76" wp14:editId="2147774C">
             <wp:extent cx="3600000" cy="2047457"/>
@@ -12246,7 +13380,7 @@
                     <pic:cNvPicPr/>
                   </pic:nvPicPr>
                   <pic:blipFill>
-                    <a:blip r:embed="rId12">
+                    <a:blip r:embed="rId15">
                       <a:extLst>
                         <a:ext uri="{28A0092B-C50C-407E-A947-70E740481C1C}">
                           <a14:useLocalDpi xmlns:a14="http://schemas.microsoft.com/office/drawing/2010/main" val="0"/>
@@ -12490,7 +13624,7 @@
       <w:r>
         <w:t xml:space="preserve"> </w:t>
       </w:r>
-      <w:hyperlink r:id="rId13" w:history="1">
+      <w:hyperlink r:id="rId16" w:history="1">
         <w:r>
           <w:rPr>
             <w:rStyle w:val="Hipervnculo"/>
@@ -12517,7 +13651,7 @@
       <w:r>
         <w:t xml:space="preserve">Greenpeace. (2025, mayo). </w:t>
       </w:r>
-      <w:hyperlink r:id="rId14" w:history="1">
+      <w:hyperlink r:id="rId17" w:history="1">
         <w:r>
           <w:rPr>
             <w:rStyle w:val="Hipervnculo"/>
@@ -12547,7 +13681,7 @@
       <w:r>
         <w:t xml:space="preserve">Servicio Nacional de Manejo del Fuego. (s.f.). </w:t>
       </w:r>
-      <w:hyperlink r:id="rId15" w:history="1">
+      <w:hyperlink r:id="rId18" w:history="1">
         <w:r>
           <w:rPr>
             <w:rStyle w:val="Hipervnculo"/>
@@ -12577,7 +13711,7 @@
       <w:r>
         <w:t xml:space="preserve">Anzola, J. D., Fuentes, L. D., y Rodríguez, E. M. (2024). </w:t>
       </w:r>
-      <w:hyperlink r:id="rId16" w:history="1">
+      <w:hyperlink r:id="rId19" w:history="1">
         <w:r>
           <w:rPr>
             <w:rStyle w:val="Hipervnculo"/>
@@ -12609,7 +13743,7 @@
       <w:r>
         <w:t xml:space="preserve">, H., Zhang, M., &amp; Wang, H. (2019). </w:t>
       </w:r>
-      <w:hyperlink r:id="rId17" w:history="1">
+      <w:hyperlink r:id="rId20" w:history="1">
         <w:r>
           <w:rPr>
             <w:rStyle w:val="Hipervnculo"/>
@@ -12797,7 +13931,7 @@
       <w:r>
         <w:t xml:space="preserve">. 2020. </w:t>
       </w:r>
-      <w:hyperlink r:id="rId18" w:history="1">
+      <w:hyperlink r:id="rId21" w:history="1">
         <w:r>
           <w:rPr>
             <w:rStyle w:val="Hipervnculo"/>
@@ -12942,7 +14076,7 @@
       <w:r>
         <w:t xml:space="preserve">Sengupta, A., &amp; Woodford, B. J. (2025). </w:t>
       </w:r>
-      <w:hyperlink r:id="rId19" w:history="1">
+      <w:hyperlink r:id="rId22" w:history="1">
         <w:proofErr w:type="spellStart"/>
         <w:r>
           <w:rPr>
@@ -13110,7 +14244,7 @@
       <w:r>
         <w:t xml:space="preserve">, M., Medel, R., Castillo, J., Vázquez, J. C., &amp; Casco, O. (2015). </w:t>
       </w:r>
-      <w:hyperlink r:id="rId20" w:history="1">
+      <w:hyperlink r:id="rId23" w:history="1">
         <w:r>
           <w:rPr>
             <w:rStyle w:val="Hipervnculo"/>
@@ -13153,7 +14287,7 @@
       <w:r>
         <w:t xml:space="preserve"> Saucedo, A., &amp; Inchausti, P. E. (2020). </w:t>
       </w:r>
-      <w:hyperlink r:id="rId21" w:history="1">
+      <w:hyperlink r:id="rId24" w:history="1">
         <w:r>
           <w:rPr>
             <w:rStyle w:val="Hipervnculo"/>
@@ -13354,7 +14488,7 @@
       <w:r>
         <w:t xml:space="preserve">, M. A. (2024). </w:t>
       </w:r>
-      <w:hyperlink r:id="rId22" w:history="1">
+      <w:hyperlink r:id="rId25" w:history="1">
         <w:proofErr w:type="spellStart"/>
         <w:r>
           <w:rPr>
@@ -13438,10 +14572,11 @@
           <w:numId w:val="1"/>
         </w:numPr>
       </w:pPr>
+      <w:bookmarkStart w:id="31" w:name="_Ref212572650"/>
       <w:r>
         <w:t xml:space="preserve">Muñoz Sabater, J. (2019): </w:t>
       </w:r>
-      <w:hyperlink r:id="rId23" w:history="1">
+      <w:hyperlink r:id="rId26" w:history="1">
         <w:r>
           <w:rPr>
             <w:rStyle w:val="Hipervnculo"/>
@@ -13532,7 +14667,11 @@
       </w:r>
       <w:proofErr w:type="spellEnd"/>
       <w:r>
-        <w:t xml:space="preserve"> Data Store (CDS). </w:t>
+        <w:t xml:space="preserve"> Data Store (CDS).</w:t>
+      </w:r>
+      <w:bookmarkEnd w:id="31"/>
+      <w:r>
+        <w:t> </w:t>
       </w:r>
     </w:p>
     <w:p>
@@ -13583,7 +14722,7 @@
       <w:r>
         <w:t>. (2024). </w:t>
       </w:r>
-      <w:hyperlink r:id="rId24" w:history="1">
+      <w:hyperlink r:id="rId27" w:history="1">
         <w:r>
           <w:rPr>
             <w:rStyle w:val="Hipervnculo"/>
@@ -13657,12 +14796,12 @@
           <w:numId w:val="1"/>
         </w:numPr>
       </w:pPr>
-      <w:bookmarkStart w:id="31" w:name="_Ref211360730"/>
+      <w:bookmarkStart w:id="32" w:name="_Ref211360730"/>
       <w:r>
         <w:lastRenderedPageBreak/>
         <w:t>Comisión Nacional de Actividades Espaciales. (s. f.). </w:t>
       </w:r>
-      <w:hyperlink r:id="rId25" w:history="1">
+      <w:hyperlink r:id="rId28" w:history="1">
         <w:r>
           <w:rPr>
             <w:rStyle w:val="Hipervnculo"/>
@@ -13675,7 +14814,7 @@
       <w:r>
         <w:t>. CONAE.</w:t>
       </w:r>
-      <w:bookmarkEnd w:id="31"/>
+      <w:bookmarkEnd w:id="32"/>
     </w:p>
     <w:p>
       <w:pPr>
@@ -13685,7 +14824,7 @@
           <w:numId w:val="1"/>
         </w:numPr>
       </w:pPr>
-      <w:bookmarkStart w:id="32" w:name="_Ref211364570"/>
+      <w:bookmarkStart w:id="33" w:name="_Ref211364570"/>
       <w:r>
         <w:t>NASA. </w:t>
       </w:r>
@@ -13834,7 +14973,7 @@
       <w:r>
         <w:t xml:space="preserve"> (EOSDIS).</w:t>
       </w:r>
-      <w:bookmarkEnd w:id="32"/>
+      <w:bookmarkEnd w:id="33"/>
     </w:p>
     <w:p>
       <w:pPr>
@@ -13844,7 +14983,7 @@
           <w:numId w:val="1"/>
         </w:numPr>
       </w:pPr>
-      <w:bookmarkStart w:id="33" w:name="_Ref212113708"/>
+      <w:bookmarkStart w:id="34" w:name="_Ref212113708"/>
       <w:r>
         <w:t>Wagner,</w:t>
       </w:r>
@@ -13876,7 +15015,7 @@
       <w:r>
         <w:t xml:space="preserve">, </w:t>
       </w:r>
-      <w:hyperlink r:id="rId26" w:history="1">
+      <w:hyperlink r:id="rId29" w:history="1">
         <w:proofErr w:type="spellStart"/>
         <w:r>
           <w:rPr>
@@ -13990,7 +15129,7 @@
       <w:r>
         <w:t>.</w:t>
       </w:r>
-      <w:bookmarkEnd w:id="33"/>
+      <w:bookmarkEnd w:id="34"/>
     </w:p>
     <w:p>
       <w:pPr>
@@ -14000,7 +15139,7 @@
           <w:numId w:val="1"/>
         </w:numPr>
       </w:pPr>
-      <w:bookmarkStart w:id="34" w:name="_Ref212141874"/>
+      <w:bookmarkStart w:id="35" w:name="_Ref212141874"/>
       <w:proofErr w:type="spellStart"/>
       <w:r>
         <w:t>wxedward</w:t>
@@ -14027,7 +15166,7 @@
       <w:r>
         <w:t>). </w:t>
       </w:r>
-      <w:hyperlink r:id="rId27" w:history="1">
+      <w:hyperlink r:id="rId30" w:history="1">
         <w:r>
           <w:rPr>
             <w:rStyle w:val="Hipervnculo"/>
@@ -14151,7 +15290,7 @@
       <w:r>
         <w:t>.</w:t>
       </w:r>
-      <w:bookmarkEnd w:id="34"/>
+      <w:bookmarkEnd w:id="35"/>
     </w:p>
     <w:p>
       <w:pPr>
@@ -14161,7 +15300,7 @@
           <w:numId w:val="1"/>
         </w:numPr>
       </w:pPr>
-      <w:bookmarkStart w:id="35" w:name="_Ref212136804"/>
+      <w:bookmarkStart w:id="36" w:name="_Ref212136804"/>
       <w:r>
         <w:t xml:space="preserve">NASA FIRMS. </w:t>
       </w:r>
@@ -14184,7 +15323,7 @@
       <w:r>
         <w:t xml:space="preserve">. </w:t>
       </w:r>
-      <w:hyperlink r:id="rId28" w:history="1">
+      <w:hyperlink r:id="rId31" w:history="1">
         <w:r>
           <w:rPr>
             <w:rStyle w:val="Hipervnculo"/>
@@ -14251,7 +15390,7 @@
       <w:r>
         <w:t>.</w:t>
       </w:r>
-      <w:bookmarkEnd w:id="35"/>
+      <w:bookmarkEnd w:id="36"/>
     </w:p>
     <w:p>
       <w:pPr>
@@ -14261,7 +15400,7 @@
           <w:numId w:val="1"/>
         </w:numPr>
       </w:pPr>
-      <w:bookmarkStart w:id="36" w:name="_Ref212136813"/>
+      <w:bookmarkStart w:id="37" w:name="_Ref212136813"/>
       <w:proofErr w:type="spellStart"/>
       <w:r>
         <w:t>Copernicus</w:t>
@@ -14286,7 +15425,7 @@
       <w:r>
         <w:t xml:space="preserve"> (C3S). </w:t>
       </w:r>
-      <w:hyperlink r:id="rId29" w:history="1">
+      <w:hyperlink r:id="rId32" w:history="1">
         <w:proofErr w:type="spellStart"/>
         <w:r>
           <w:rPr>
@@ -14343,7 +15482,7 @@
       <w:r>
         <w:t xml:space="preserve"> Base.</w:t>
       </w:r>
-      <w:bookmarkEnd w:id="36"/>
+      <w:bookmarkEnd w:id="37"/>
     </w:p>
     <w:p>
       <w:pPr>
@@ -14355,7 +15494,7 @@
       </w:pPr>
     </w:p>
     <w:sectPr>
-      <w:footerReference w:type="default" r:id="rId30"/>
+      <w:footerReference w:type="default" r:id="rId33"/>
       <w:pgSz w:w="11906" w:h="16838"/>
       <w:pgMar w:top="1417" w:right="1701" w:bottom="1417" w:left="1701" w:header="708" w:footer="708" w:gutter="0"/>
       <w:pgNumType w:start="0"/>
@@ -16356,6 +17495,25 @@
       <w:ind w:left="440"/>
     </w:pPr>
   </w:style>
+  <w:style w:type="table" w:styleId="Tablaconcuadrcula">
+    <w:name w:val="Table Grid"/>
+    <w:basedOn w:val="Tablanormal"/>
+    <w:uiPriority w:val="39"/>
+    <w:rsid w:val="00D254EB"/>
+    <w:pPr>
+      <w:spacing w:line="240" w:lineRule="auto"/>
+    </w:pPr>
+    <w:tblPr>
+      <w:tblBorders>
+        <w:top w:val="single" w:sz="4" w:space="0" w:color="auto"/>
+        <w:left w:val="single" w:sz="4" w:space="0" w:color="auto"/>
+        <w:bottom w:val="single" w:sz="4" w:space="0" w:color="auto"/>
+        <w:right w:val="single" w:sz="4" w:space="0" w:color="auto"/>
+        <w:insideH w:val="single" w:sz="4" w:space="0" w:color="auto"/>
+        <w:insideV w:val="single" w:sz="4" w:space="0" w:color="auto"/>
+      </w:tblBorders>
+    </w:tblPr>
+  </w:style>
 </w:styles>
 </file>
 

</xml_diff>

<commit_message>
Update: Limpieza y juego con modelos.
</commit_message>
<xml_diff>
--- a/docs/Tesis - Villagra Turco, Ezequiel.docx
+++ b/docs/Tesis - Villagra Turco, Ezequiel.docx
@@ -10703,6 +10703,23 @@
     </w:p>
     <w:p>
       <w:pPr>
+        <w:pStyle w:val="Ttulo2"/>
+        <w:ind w:firstLine="0"/>
+        <w:rPr>
+          <w:rFonts w:ascii="Times New Roman" w:hAnsi="Times New Roman" w:cs="Times New Roman"/>
+          <w:color w:val="000000" w:themeColor="text1"/>
+        </w:rPr>
+      </w:pPr>
+      <w:r>
+        <w:rPr>
+          <w:rFonts w:ascii="Times New Roman" w:hAnsi="Times New Roman" w:cs="Times New Roman"/>
+          <w:color w:val="000000" w:themeColor="text1"/>
+        </w:rPr>
+        <w:t>Resolución</w:t>
+      </w:r>
+    </w:p>
+    <w:p>
+      <w:pPr>
         <w:ind w:firstLine="0"/>
         <w:jc w:val="both"/>
         <w:rPr>
@@ -11768,6 +11785,7 @@
         <w:rPr>
           <w:noProof/>
         </w:rPr>
+        <w:lastRenderedPageBreak/>
         <w:drawing>
           <wp:inline distT="0" distB="0" distL="0" distR="0" wp14:anchorId="5D2612C2" wp14:editId="5FF98BE7">
             <wp:extent cx="3046021" cy="2445342"/>
@@ -11884,7 +11902,7 @@
           <w:noProof/>
         </w:rPr>
         <w:drawing>
-          <wp:inline distT="0" distB="0" distL="0" distR="0" wp14:anchorId="1B628224" wp14:editId="43BDF691">
+          <wp:inline distT="0" distB="0" distL="0" distR="0" wp14:anchorId="1B628224" wp14:editId="4B238DA7">
             <wp:extent cx="5400040" cy="2138045"/>
             <wp:effectExtent l="0" t="0" r="0" b="0"/>
             <wp:docPr id="91008185" name="Imagen 1" descr="Gráfico, Calendario&#10;&#10;El contenido generado por IA puede ser incorrecto."/>
@@ -11994,7 +12012,63 @@
         <w:t xml:space="preserve"> - Mapeo de coordenadas y frecuencia de observaciones.</w:t>
       </w:r>
     </w:p>
-    <w:p/>
+    <w:p>
+      <w:r>
+        <w:br w:type="page"/>
+      </w:r>
+    </w:p>
+    <w:p>
+      <w:pPr>
+        <w:pStyle w:val="Ttulo2"/>
+        <w:ind w:firstLine="0"/>
+        <w:rPr>
+          <w:rFonts w:ascii="Times New Roman" w:hAnsi="Times New Roman" w:cs="Times New Roman"/>
+          <w:color w:val="000000" w:themeColor="text1"/>
+        </w:rPr>
+      </w:pPr>
+      <w:proofErr w:type="spellStart"/>
+      <w:r>
+        <w:rPr>
+          <w:rFonts w:ascii="Times New Roman" w:hAnsi="Times New Roman" w:cs="Times New Roman"/>
+          <w:color w:val="000000" w:themeColor="text1"/>
+        </w:rPr>
+        <w:lastRenderedPageBreak/>
+        <w:t>Fire</w:t>
+      </w:r>
+      <w:proofErr w:type="spellEnd"/>
+      <w:r>
+        <w:rPr>
+          <w:rFonts w:ascii="Times New Roman" w:hAnsi="Times New Roman" w:cs="Times New Roman"/>
+          <w:color w:val="000000" w:themeColor="text1"/>
+        </w:rPr>
+        <w:t xml:space="preserve"> </w:t>
+      </w:r>
+      <w:proofErr w:type="spellStart"/>
+      <w:r>
+        <w:rPr>
+          <w:rFonts w:ascii="Times New Roman" w:hAnsi="Times New Roman" w:cs="Times New Roman"/>
+          <w:color w:val="000000" w:themeColor="text1"/>
+        </w:rPr>
+        <w:t>Weather</w:t>
+      </w:r>
+      <w:proofErr w:type="spellEnd"/>
+      <w:r>
+        <w:rPr>
+          <w:rFonts w:ascii="Times New Roman" w:hAnsi="Times New Roman" w:cs="Times New Roman"/>
+          <w:color w:val="000000" w:themeColor="text1"/>
+        </w:rPr>
+        <w:t xml:space="preserve"> </w:t>
+      </w:r>
+      <w:proofErr w:type="spellStart"/>
+      <w:r>
+        <w:rPr>
+          <w:rFonts w:ascii="Times New Roman" w:hAnsi="Times New Roman" w:cs="Times New Roman"/>
+          <w:color w:val="000000" w:themeColor="text1"/>
+        </w:rPr>
+        <w:t>Index</w:t>
+      </w:r>
+      <w:proofErr w:type="spellEnd"/>
+    </w:p>
     <w:p>
       <w:pPr>
         <w:ind w:firstLine="0"/>
@@ -12158,9 +12232,8 @@
         <w:rPr>
           <w:noProof/>
         </w:rPr>
-        <w:lastRenderedPageBreak/>
         <w:drawing>
-          <wp:inline distT="0" distB="0" distL="0" distR="0" wp14:anchorId="3C7A16B2" wp14:editId="4FB73D78">
+          <wp:inline distT="0" distB="0" distL="0" distR="0" wp14:anchorId="3C7A16B2" wp14:editId="7410FF6A">
             <wp:extent cx="5278581" cy="1303507"/>
             <wp:effectExtent l="0" t="0" r="0" b="0"/>
             <wp:docPr id="1153105388" name="Imagen 2"/>
@@ -12282,7 +12355,7 @@
           <w:noProof/>
         </w:rPr>
         <w:drawing>
-          <wp:inline distT="0" distB="0" distL="0" distR="0" wp14:anchorId="59AC7870" wp14:editId="4F3C19D1">
+          <wp:inline distT="0" distB="0" distL="0" distR="0" wp14:anchorId="59AC7870" wp14:editId="50B61358">
             <wp:extent cx="5400040" cy="1452880"/>
             <wp:effectExtent l="0" t="0" r="0" b="0"/>
             <wp:docPr id="724237226" name="Imagen 3"/>
@@ -12448,6 +12521,7 @@
                 <w:lang w:eastAsia="es-AR"/>
                 <w14:ligatures w14:val="none"/>
               </w:rPr>
+              <w:lastRenderedPageBreak/>
               <w:t>Métrica</w:t>
             </w:r>
           </w:p>
@@ -13169,6 +13243,29 @@
     </w:p>
     <w:p>
       <w:pPr>
+        <w:ind w:firstLine="0"/>
+      </w:pPr>
+    </w:p>
+    <w:p>
+      <w:pPr>
+        <w:pStyle w:val="Ttulo2"/>
+        <w:ind w:firstLine="0"/>
+        <w:rPr>
+          <w:rFonts w:ascii="Times New Roman" w:hAnsi="Times New Roman" w:cs="Times New Roman"/>
+          <w:color w:val="000000" w:themeColor="text1"/>
+        </w:rPr>
+      </w:pPr>
+      <w:r>
+        <w:rPr>
+          <w:rFonts w:ascii="Times New Roman" w:hAnsi="Times New Roman" w:cs="Times New Roman"/>
+          <w:color w:val="000000" w:themeColor="text1"/>
+        </w:rPr>
+        <w:t>Focos de calor</w:t>
+      </w:r>
+    </w:p>
+    <w:p/>
+    <w:p>
+      <w:pPr>
         <w:pStyle w:val="Ttulo1"/>
         <w:ind w:firstLine="0"/>
         <w:rPr>
@@ -13266,7 +13363,6 @@
           <w:rFonts w:ascii="Times New Roman" w:hAnsi="Times New Roman" w:cs="Times New Roman"/>
           <w:color w:val="000000" w:themeColor="text1"/>
         </w:rPr>
-        <w:lastRenderedPageBreak/>
         <w:t>Apéndices</w:t>
       </w:r>
       <w:bookmarkEnd w:id="14"/>
@@ -13364,6 +13460,7 @@
         <w:rPr>
           <w:noProof/>
         </w:rPr>
+        <w:lastRenderedPageBreak/>
         <w:drawing>
           <wp:inline distT="0" distB="0" distL="0" distR="0" wp14:anchorId="5B09DC76" wp14:editId="2147774C">
             <wp:extent cx="3600000" cy="2047457"/>

</xml_diff>

<commit_message>
Update: Anda a saber
</commit_message>
<xml_diff>
--- a/docs/Tesis - Villagra Turco, Ezequiel.docx
+++ b/docs/Tesis - Villagra Turco, Ezequiel.docx
@@ -10584,7 +10584,7 @@
         </w:rPr>
         <w:lastRenderedPageBreak/>
         <w:drawing>
-          <wp:inline distT="0" distB="0" distL="0" distR="0" wp14:anchorId="39D5FC54" wp14:editId="5C7EF69C">
+          <wp:inline distT="0" distB="0" distL="0" distR="0" wp14:anchorId="39D5FC54" wp14:editId="52FA78BB">
             <wp:extent cx="3600000" cy="1928269"/>
             <wp:effectExtent l="0" t="0" r="635" b="0"/>
             <wp:docPr id="1472466900" name="Imagen 2" descr="Gráfico&#10;&#10;El contenido generado por IA puede ser incorrecto."/>
@@ -10630,7 +10630,7 @@
           <w:noProof/>
         </w:rPr>
         <w:drawing>
-          <wp:inline distT="0" distB="0" distL="0" distR="0" wp14:anchorId="7391F9E1" wp14:editId="30E501B3">
+          <wp:inline distT="0" distB="0" distL="0" distR="0" wp14:anchorId="7391F9E1" wp14:editId="665B2DD7">
             <wp:extent cx="3600000" cy="1928269"/>
             <wp:effectExtent l="0" t="0" r="635" b="0"/>
             <wp:docPr id="315828563" name="Imagen 1" descr="Gráfico&#10;&#10;El contenido generado por IA puede ser incorrecto."/>
@@ -14988,7 +14988,7 @@
           <w:noProof/>
         </w:rPr>
         <w:drawing>
-          <wp:inline distT="0" distB="0" distL="0" distR="0" wp14:anchorId="1B628224" wp14:editId="0A63C764">
+          <wp:inline distT="0" distB="0" distL="0" distR="0" wp14:anchorId="1B628224" wp14:editId="7D2743A6">
             <wp:extent cx="5400040" cy="2138045"/>
             <wp:effectExtent l="0" t="0" r="0" b="0"/>
             <wp:docPr id="91008185" name="Imagen 1" descr="Gráfico, Calendario&#10;&#10;El contenido generado por IA puede ser incorrecto."/>
@@ -16479,21 +16479,21 @@
           <w:rFonts w:cs="Times New Roman"/>
           <w:color w:val="000000" w:themeColor="text1"/>
         </w:rPr>
-        <w:t xml:space="preserve">El </w:t>
-      </w:r>
-      <w:r>
-        <w:rPr>
-          <w:rFonts w:cs="Times New Roman"/>
-          <w:color w:val="000000" w:themeColor="text1"/>
-        </w:rPr>
-        <w:t xml:space="preserve">conjunto </w:t>
-      </w:r>
-      <w:r>
-        <w:rPr>
-          <w:rFonts w:cs="Times New Roman"/>
-          <w:color w:val="000000" w:themeColor="text1"/>
-        </w:rPr>
-        <w:t>de datos, posee variables altamente correlacionadas que deberán ser evaluadas previo a la etapa de entrenamiento.</w:t>
+        <w:t xml:space="preserve">El conjunto de </w:t>
+      </w:r>
+      <w:r>
+        <w:rPr>
+          <w:rFonts w:cs="Times New Roman"/>
+          <w:color w:val="000000" w:themeColor="text1"/>
+        </w:rPr>
+        <w:t>datos</w:t>
+      </w:r>
+      <w:r>
+        <w:rPr>
+          <w:rFonts w:cs="Times New Roman"/>
+          <w:color w:val="000000" w:themeColor="text1"/>
+        </w:rPr>
+        <w:t xml:space="preserve"> posee variables altamente correlacionadas que deberán ser evaluadas previo a la etapa de entrenamiento.</w:t>
       </w:r>
     </w:p>
     <w:p>

</xml_diff>